<commit_message>
Minor Task 1 Arch. Update
</commit_message>
<xml_diff>
--- a/Program/Task 1 - Login Components/Task 1 Architecture.docx
+++ b/Program/Task 1 - Login Components/Task 1 Architecture.docx
@@ -654,17 +654,19 @@
     </w:p>
     <w:p>
       <w:pPr>
-        <w:spacing w:line="480" w:lineRule="auto"/>
-        <w:ind w:left="720"/>
-        <w:rPr>
-          <w:rFonts w:ascii="Times New Roman" w:hAnsi="Times New Roman" w:cs="Times New Roman"/>
-        </w:rPr>
-      </w:pPr>
-      <w:r>
-        <w:rPr>
-          <w:rFonts w:ascii="Times New Roman" w:hAnsi="Times New Roman" w:cs="Times New Roman"/>
-        </w:rPr>
-        <w:t>//</w:t>
+        <w:rPr>
+          <w:rFonts w:ascii="Times New Roman" w:hAnsi="Times New Roman" w:cs="Times New Roman"/>
+          <w:sz w:val="18"/>
+          <w:szCs w:val="18"/>
+        </w:rPr>
+      </w:pPr>
+      <w:r>
+        <w:rPr>
+          <w:rFonts w:ascii="Times New Roman" w:hAnsi="Times New Roman" w:cs="Times New Roman"/>
+          <w:sz w:val="18"/>
+          <w:szCs w:val="18"/>
+        </w:rPr>
+        <w:tab/>
       </w:r>
     </w:p>
     <w:p>
@@ -739,26 +741,26 @@
           <w:sz w:val="18"/>
           <w:szCs w:val="18"/>
         </w:rPr>
+        <w:t>Incorrect password</w:t>
+      </w:r>
+    </w:p>
+    <w:p>
+      <w:pPr>
+        <w:spacing w:line="480" w:lineRule="auto"/>
+        <w:ind w:left="720"/>
+        <w:rPr>
+          <w:rFonts w:ascii="Times New Roman" w:hAnsi="Times New Roman" w:cs="Times New Roman"/>
+          <w:sz w:val="18"/>
+          <w:szCs w:val="18"/>
+        </w:rPr>
+      </w:pPr>
+      <w:r>
+        <w:rPr>
+          <w:rFonts w:ascii="Times New Roman" w:hAnsi="Times New Roman" w:cs="Times New Roman"/>
+          <w:sz w:val="18"/>
+          <w:szCs w:val="18"/>
+        </w:rPr>
         <w:lastRenderedPageBreak/>
-        <w:t>Incorrect password</w:t>
-      </w:r>
-    </w:p>
-    <w:p>
-      <w:pPr>
-        <w:spacing w:line="480" w:lineRule="auto"/>
-        <w:ind w:left="720"/>
-        <w:rPr>
-          <w:rFonts w:ascii="Times New Roman" w:hAnsi="Times New Roman" w:cs="Times New Roman"/>
-          <w:sz w:val="18"/>
-          <w:szCs w:val="18"/>
-        </w:rPr>
-      </w:pPr>
-      <w:r>
-        <w:rPr>
-          <w:rFonts w:ascii="Times New Roman" w:hAnsi="Times New Roman" w:cs="Times New Roman"/>
-          <w:sz w:val="18"/>
-          <w:szCs w:val="18"/>
-        </w:rPr>
         <w:t>Incorrect username</w:t>
       </w:r>
     </w:p>
@@ -1475,7 +1477,6 @@
           <w:b/>
           <w:bCs/>
         </w:rPr>
-        <w:lastRenderedPageBreak/>
         <w:t>Sign Up Process pt.2</w:t>
       </w:r>
     </w:p>
@@ -1499,6 +1500,7 @@
           <w:sz w:val="18"/>
           <w:szCs w:val="18"/>
         </w:rPr>
+        <w:lastRenderedPageBreak/>
         <w:t>User inputs username</w:t>
       </w:r>
     </w:p>
@@ -1895,6 +1897,119 @@
     </w:lvl>
   </w:abstractNum>
   <w:abstractNum w:abstractNumId="1" w15:restartNumberingAfterBreak="0">
+    <w:nsid w:val="3FA43CCB"/>
+    <w:multiLevelType w:val="hybridMultilevel"/>
+    <w:tmpl w:val="63F2BEF0"/>
+    <w:lvl w:ilvl="0" w:tplc="7A58DF5C">
+      <w:start w:val="1"/>
+      <w:numFmt w:val="bullet"/>
+      <w:lvlText w:val=""/>
+      <w:lvlJc w:val="left"/>
+      <w:pPr>
+        <w:ind w:left="1800" w:hanging="360"/>
+      </w:pPr>
+      <w:rPr>
+        <w:rFonts w:ascii="Symbol" w:eastAsiaTheme="minorHAnsi" w:hAnsi="Symbol" w:cs="Times New Roman" w:hint="default"/>
+      </w:rPr>
+    </w:lvl>
+    <w:lvl w:ilvl="1" w:tplc="04090003" w:tentative="1">
+      <w:start w:val="1"/>
+      <w:numFmt w:val="bullet"/>
+      <w:lvlText w:val="o"/>
+      <w:lvlJc w:val="left"/>
+      <w:pPr>
+        <w:ind w:left="2520" w:hanging="360"/>
+      </w:pPr>
+      <w:rPr>
+        <w:rFonts w:ascii="Courier New" w:hAnsi="Courier New" w:cs="Courier New" w:hint="default"/>
+      </w:rPr>
+    </w:lvl>
+    <w:lvl w:ilvl="2" w:tplc="04090005" w:tentative="1">
+      <w:start w:val="1"/>
+      <w:numFmt w:val="bullet"/>
+      <w:lvlText w:val=""/>
+      <w:lvlJc w:val="left"/>
+      <w:pPr>
+        <w:ind w:left="3240" w:hanging="360"/>
+      </w:pPr>
+      <w:rPr>
+        <w:rFonts w:ascii="Wingdings" w:hAnsi="Wingdings" w:hint="default"/>
+      </w:rPr>
+    </w:lvl>
+    <w:lvl w:ilvl="3" w:tplc="04090001" w:tentative="1">
+      <w:start w:val="1"/>
+      <w:numFmt w:val="bullet"/>
+      <w:lvlText w:val=""/>
+      <w:lvlJc w:val="left"/>
+      <w:pPr>
+        <w:ind w:left="3960" w:hanging="360"/>
+      </w:pPr>
+      <w:rPr>
+        <w:rFonts w:ascii="Symbol" w:hAnsi="Symbol" w:hint="default"/>
+      </w:rPr>
+    </w:lvl>
+    <w:lvl w:ilvl="4" w:tplc="04090003" w:tentative="1">
+      <w:start w:val="1"/>
+      <w:numFmt w:val="bullet"/>
+      <w:lvlText w:val="o"/>
+      <w:lvlJc w:val="left"/>
+      <w:pPr>
+        <w:ind w:left="4680" w:hanging="360"/>
+      </w:pPr>
+      <w:rPr>
+        <w:rFonts w:ascii="Courier New" w:hAnsi="Courier New" w:cs="Courier New" w:hint="default"/>
+      </w:rPr>
+    </w:lvl>
+    <w:lvl w:ilvl="5" w:tplc="04090005" w:tentative="1">
+      <w:start w:val="1"/>
+      <w:numFmt w:val="bullet"/>
+      <w:lvlText w:val=""/>
+      <w:lvlJc w:val="left"/>
+      <w:pPr>
+        <w:ind w:left="5400" w:hanging="360"/>
+      </w:pPr>
+      <w:rPr>
+        <w:rFonts w:ascii="Wingdings" w:hAnsi="Wingdings" w:hint="default"/>
+      </w:rPr>
+    </w:lvl>
+    <w:lvl w:ilvl="6" w:tplc="04090001" w:tentative="1">
+      <w:start w:val="1"/>
+      <w:numFmt w:val="bullet"/>
+      <w:lvlText w:val=""/>
+      <w:lvlJc w:val="left"/>
+      <w:pPr>
+        <w:ind w:left="6120" w:hanging="360"/>
+      </w:pPr>
+      <w:rPr>
+        <w:rFonts w:ascii="Symbol" w:hAnsi="Symbol" w:hint="default"/>
+      </w:rPr>
+    </w:lvl>
+    <w:lvl w:ilvl="7" w:tplc="04090003" w:tentative="1">
+      <w:start w:val="1"/>
+      <w:numFmt w:val="bullet"/>
+      <w:lvlText w:val="o"/>
+      <w:lvlJc w:val="left"/>
+      <w:pPr>
+        <w:ind w:left="6840" w:hanging="360"/>
+      </w:pPr>
+      <w:rPr>
+        <w:rFonts w:ascii="Courier New" w:hAnsi="Courier New" w:cs="Courier New" w:hint="default"/>
+      </w:rPr>
+    </w:lvl>
+    <w:lvl w:ilvl="8" w:tplc="04090005" w:tentative="1">
+      <w:start w:val="1"/>
+      <w:numFmt w:val="bullet"/>
+      <w:lvlText w:val=""/>
+      <w:lvlJc w:val="left"/>
+      <w:pPr>
+        <w:ind w:left="7560" w:hanging="360"/>
+      </w:pPr>
+      <w:rPr>
+        <w:rFonts w:ascii="Wingdings" w:hAnsi="Wingdings" w:hint="default"/>
+      </w:rPr>
+    </w:lvl>
+  </w:abstractNum>
+  <w:abstractNum w:abstractNumId="2" w15:restartNumberingAfterBreak="0">
     <w:nsid w:val="4A6C59DA"/>
     <w:multiLevelType w:val="hybridMultilevel"/>
     <w:tmpl w:val="5DC6D164"/>
@@ -1983,7 +2098,7 @@
       </w:pPr>
     </w:lvl>
   </w:abstractNum>
-  <w:abstractNum w:abstractNumId="2" w15:restartNumberingAfterBreak="0">
+  <w:abstractNum w:abstractNumId="3" w15:restartNumberingAfterBreak="0">
     <w:nsid w:val="557A6B48"/>
     <w:multiLevelType w:val="hybridMultilevel"/>
     <w:tmpl w:val="7608A328"/>
@@ -2072,7 +2187,7 @@
       </w:pPr>
     </w:lvl>
   </w:abstractNum>
-  <w:abstractNum w:abstractNumId="3" w15:restartNumberingAfterBreak="0">
+  <w:abstractNum w:abstractNumId="4" w15:restartNumberingAfterBreak="0">
     <w:nsid w:val="7E014C06"/>
     <w:multiLevelType w:val="hybridMultilevel"/>
     <w:tmpl w:val="84705F16"/>
@@ -2188,13 +2303,16 @@
     <w:abstractNumId w:val="0"/>
   </w:num>
   <w:num w:numId="2" w16cid:durableId="141435576">
-    <w:abstractNumId w:val="1"/>
+    <w:abstractNumId w:val="2"/>
   </w:num>
   <w:num w:numId="3" w16cid:durableId="805199316">
-    <w:abstractNumId w:val="2"/>
+    <w:abstractNumId w:val="3"/>
   </w:num>
   <w:num w:numId="4" w16cid:durableId="61103547">
-    <w:abstractNumId w:val="3"/>
+    <w:abstractNumId w:val="4"/>
+  </w:num>
+  <w:num w:numId="5" w16cid:durableId="1796486732">
+    <w:abstractNumId w:val="1"/>
   </w:num>
 </w:numbering>
 </file>

</xml_diff>

<commit_message>
Task 1, Login Architecture Design updated
</commit_message>
<xml_diff>
--- a/Program/Task 1 - Login Components/Task 1 Architecture.docx
+++ b/Program/Task 1 - Login Components/Task 1 Architecture.docx
@@ -5,16 +5,81 @@
     <w:p>
       <w:pPr>
         <w:spacing w:line="480" w:lineRule="auto"/>
-        <w:rPr>
-          <w:rFonts w:ascii="Times New Roman" w:hAnsi="Times New Roman" w:cs="Times New Roman"/>
-        </w:rPr>
-      </w:pPr>
-      <w:r>
+        <w:jc w:val="right"/>
         <w:rPr>
           <w:rFonts w:ascii="Times New Roman" w:hAnsi="Times New Roman" w:cs="Times New Roman"/>
           <w:b/>
           <w:bCs/>
         </w:rPr>
+      </w:pPr>
+      <w:r>
+        <w:rPr>
+          <w:rFonts w:ascii="Times New Roman" w:hAnsi="Times New Roman" w:cs="Times New Roman"/>
+          <w:b/>
+          <w:bCs/>
+        </w:rPr>
+        <w:t>Keys</w:t>
+      </w:r>
+    </w:p>
+    <w:p>
+      <w:pPr>
+        <w:spacing w:line="480" w:lineRule="auto"/>
+        <w:jc w:val="right"/>
+        <w:rPr>
+          <w:rFonts w:ascii="Times New Roman" w:hAnsi="Times New Roman" w:cs="Times New Roman"/>
+          <w:sz w:val="18"/>
+          <w:szCs w:val="18"/>
+        </w:rPr>
+      </w:pPr>
+      <w:r>
+        <w:rPr>
+          <w:rFonts w:ascii="Times New Roman" w:hAnsi="Times New Roman" w:cs="Times New Roman"/>
+          <w:sz w:val="18"/>
+          <w:szCs w:val="18"/>
+        </w:rPr>
+        <w:t>not a required parameter</w:t>
+      </w:r>
+      <w:r>
+        <w:rPr>
+          <w:rFonts w:ascii="Times New Roman" w:hAnsi="Times New Roman" w:cs="Times New Roman"/>
+          <w:sz w:val="18"/>
+          <w:szCs w:val="18"/>
+        </w:rPr>
+        <w:t xml:space="preserve"> = NRP</w:t>
+      </w:r>
+    </w:p>
+    <w:p>
+      <w:pPr>
+        <w:spacing w:line="480" w:lineRule="auto"/>
+        <w:jc w:val="right"/>
+        <w:rPr>
+          <w:rFonts w:ascii="Times New Roman" w:hAnsi="Times New Roman" w:cs="Times New Roman"/>
+          <w:b/>
+          <w:bCs/>
+        </w:rPr>
+      </w:pPr>
+      <w:r>
+        <w:rPr>
+          <w:rFonts w:ascii="Times New Roman" w:hAnsi="Times New Roman" w:cs="Times New Roman"/>
+          <w:sz w:val="18"/>
+          <w:szCs w:val="18"/>
+        </w:rPr>
+        <w:t>string type = str</w:t>
+      </w:r>
+    </w:p>
+    <w:p>
+      <w:pPr>
+        <w:spacing w:line="480" w:lineRule="auto"/>
+        <w:rPr>
+          <w:rFonts w:ascii="Times New Roman" w:hAnsi="Times New Roman" w:cs="Times New Roman"/>
+        </w:rPr>
+      </w:pPr>
+      <w:r>
+        <w:rPr>
+          <w:rFonts w:ascii="Times New Roman" w:hAnsi="Times New Roman" w:cs="Times New Roman"/>
+          <w:b/>
+          <w:bCs/>
+        </w:rPr>
         <w:t>Classes</w:t>
       </w:r>
     </w:p>
@@ -35,6 +100,845 @@
           <w:szCs w:val="18"/>
         </w:rPr>
         <w:t>Account</w:t>
+      </w:r>
+      <w:r>
+        <w:rPr>
+          <w:rFonts w:ascii="Times New Roman" w:hAnsi="Times New Roman" w:cs="Times New Roman"/>
+          <w:sz w:val="18"/>
+          <w:szCs w:val="18"/>
+        </w:rPr>
+        <w:t xml:space="preserve"> (or </w:t>
+      </w:r>
+      <w:proofErr w:type="spellStart"/>
+      <w:r>
+        <w:rPr>
+          <w:rFonts w:ascii="Times New Roman" w:hAnsi="Times New Roman" w:cs="Times New Roman"/>
+          <w:sz w:val="18"/>
+          <w:szCs w:val="18"/>
+        </w:rPr>
+        <w:t>StaffAccount</w:t>
+      </w:r>
+      <w:proofErr w:type="spellEnd"/>
+      <w:r>
+        <w:rPr>
+          <w:rFonts w:ascii="Times New Roman" w:hAnsi="Times New Roman" w:cs="Times New Roman"/>
+          <w:sz w:val="18"/>
+          <w:szCs w:val="18"/>
+        </w:rPr>
+        <w:t>)</w:t>
+      </w:r>
+    </w:p>
+    <w:p>
+      <w:pPr>
+        <w:spacing w:line="480" w:lineRule="auto"/>
+        <w:ind w:left="720"/>
+        <w:rPr>
+          <w:rFonts w:ascii="Times New Roman" w:hAnsi="Times New Roman" w:cs="Times New Roman"/>
+          <w:sz w:val="18"/>
+          <w:szCs w:val="18"/>
+        </w:rPr>
+      </w:pPr>
+      <w:r>
+        <w:rPr>
+          <w:rFonts w:ascii="Times New Roman" w:hAnsi="Times New Roman" w:cs="Times New Roman"/>
+          <w:sz w:val="18"/>
+          <w:szCs w:val="18"/>
+        </w:rPr>
+        <w:tab/>
+      </w:r>
+      <w:r>
+        <w:rPr>
+          <w:rFonts w:ascii="Times New Roman" w:hAnsi="Times New Roman" w:cs="Times New Roman"/>
+          <w:sz w:val="18"/>
+          <w:szCs w:val="18"/>
+          <w:u w:val="single"/>
+        </w:rPr>
+        <w:t>Attributes:</w:t>
+      </w:r>
+      <w:r>
+        <w:rPr>
+          <w:rFonts w:ascii="Times New Roman" w:hAnsi="Times New Roman" w:cs="Times New Roman"/>
+          <w:sz w:val="18"/>
+          <w:szCs w:val="18"/>
+        </w:rPr>
+        <w:t xml:space="preserve"> </w:t>
+      </w:r>
+      <w:proofErr w:type="spellStart"/>
+      <w:r>
+        <w:rPr>
+          <w:rFonts w:ascii="Times New Roman" w:hAnsi="Times New Roman" w:cs="Times New Roman"/>
+          <w:sz w:val="18"/>
+          <w:szCs w:val="18"/>
+        </w:rPr>
+        <w:t>firstName</w:t>
+      </w:r>
+      <w:proofErr w:type="spellEnd"/>
+      <w:r>
+        <w:rPr>
+          <w:rFonts w:ascii="Times New Roman" w:hAnsi="Times New Roman" w:cs="Times New Roman"/>
+          <w:sz w:val="18"/>
+          <w:szCs w:val="18"/>
+        </w:rPr>
+        <w:t xml:space="preserve"> (str)</w:t>
+      </w:r>
+      <w:r>
+        <w:rPr>
+          <w:rFonts w:ascii="Times New Roman" w:hAnsi="Times New Roman" w:cs="Times New Roman"/>
+          <w:sz w:val="18"/>
+          <w:szCs w:val="18"/>
+        </w:rPr>
+        <w:t xml:space="preserve">, </w:t>
+      </w:r>
+      <w:proofErr w:type="spellStart"/>
+      <w:r>
+        <w:rPr>
+          <w:rFonts w:ascii="Times New Roman" w:hAnsi="Times New Roman" w:cs="Times New Roman"/>
+          <w:sz w:val="18"/>
+          <w:szCs w:val="18"/>
+        </w:rPr>
+        <w:t>lastName</w:t>
+      </w:r>
+      <w:proofErr w:type="spellEnd"/>
+      <w:r>
+        <w:rPr>
+          <w:rFonts w:ascii="Times New Roman" w:hAnsi="Times New Roman" w:cs="Times New Roman"/>
+          <w:sz w:val="18"/>
+          <w:szCs w:val="18"/>
+        </w:rPr>
+        <w:t xml:space="preserve"> (str)</w:t>
+      </w:r>
+      <w:r>
+        <w:rPr>
+          <w:rFonts w:ascii="Times New Roman" w:hAnsi="Times New Roman" w:cs="Times New Roman"/>
+          <w:sz w:val="18"/>
+          <w:szCs w:val="18"/>
+        </w:rPr>
+        <w:t>, role</w:t>
+      </w:r>
+      <w:r>
+        <w:rPr>
+          <w:rFonts w:ascii="Times New Roman" w:hAnsi="Times New Roman" w:cs="Times New Roman"/>
+          <w:sz w:val="18"/>
+          <w:szCs w:val="18"/>
+        </w:rPr>
+        <w:t xml:space="preserve"> (</w:t>
+      </w:r>
+      <w:r>
+        <w:rPr>
+          <w:rFonts w:ascii="Times New Roman" w:hAnsi="Times New Roman" w:cs="Times New Roman"/>
+          <w:sz w:val="18"/>
+          <w:szCs w:val="18"/>
+        </w:rPr>
+        <w:t>str</w:t>
+      </w:r>
+      <w:r>
+        <w:rPr>
+          <w:rFonts w:ascii="Times New Roman" w:hAnsi="Times New Roman" w:cs="Times New Roman"/>
+          <w:sz w:val="18"/>
+          <w:szCs w:val="18"/>
+        </w:rPr>
+        <w:t>)</w:t>
+      </w:r>
+      <w:r>
+        <w:rPr>
+          <w:rFonts w:ascii="Times New Roman" w:hAnsi="Times New Roman" w:cs="Times New Roman"/>
+          <w:sz w:val="18"/>
+          <w:szCs w:val="18"/>
+        </w:rPr>
+        <w:t>, username</w:t>
+      </w:r>
+      <w:r>
+        <w:rPr>
+          <w:rFonts w:ascii="Times New Roman" w:hAnsi="Times New Roman" w:cs="Times New Roman"/>
+          <w:sz w:val="18"/>
+          <w:szCs w:val="18"/>
+        </w:rPr>
+        <w:t xml:space="preserve"> (</w:t>
+      </w:r>
+      <w:r>
+        <w:rPr>
+          <w:rFonts w:ascii="Times New Roman" w:hAnsi="Times New Roman" w:cs="Times New Roman"/>
+          <w:sz w:val="18"/>
+          <w:szCs w:val="18"/>
+        </w:rPr>
+        <w:t>st</w:t>
+      </w:r>
+      <w:r>
+        <w:rPr>
+          <w:rFonts w:ascii="Times New Roman" w:hAnsi="Times New Roman" w:cs="Times New Roman"/>
+          <w:sz w:val="18"/>
+          <w:szCs w:val="18"/>
+        </w:rPr>
+        <w:t>r</w:t>
+      </w:r>
+      <w:r>
+        <w:rPr>
+          <w:rFonts w:ascii="Times New Roman" w:hAnsi="Times New Roman" w:cs="Times New Roman"/>
+          <w:sz w:val="18"/>
+          <w:szCs w:val="18"/>
+        </w:rPr>
+        <w:t>)</w:t>
+      </w:r>
+    </w:p>
+    <w:p>
+      <w:pPr>
+        <w:spacing w:line="480" w:lineRule="auto"/>
+        <w:ind w:left="720"/>
+        <w:rPr>
+          <w:rFonts w:ascii="Times New Roman" w:hAnsi="Times New Roman" w:cs="Times New Roman"/>
+          <w:sz w:val="18"/>
+          <w:szCs w:val="18"/>
+        </w:rPr>
+      </w:pPr>
+      <w:r>
+        <w:rPr>
+          <w:rFonts w:ascii="Times New Roman" w:hAnsi="Times New Roman" w:cs="Times New Roman"/>
+          <w:sz w:val="18"/>
+          <w:szCs w:val="18"/>
+        </w:rPr>
+        <w:tab/>
+      </w:r>
+      <w:r>
+        <w:rPr>
+          <w:rFonts w:ascii="Times New Roman" w:hAnsi="Times New Roman" w:cs="Times New Roman"/>
+          <w:sz w:val="18"/>
+          <w:szCs w:val="18"/>
+          <w:u w:val="single"/>
+        </w:rPr>
+        <w:t>Functions:</w:t>
+      </w:r>
+      <w:r>
+        <w:rPr>
+          <w:rFonts w:ascii="Times New Roman" w:hAnsi="Times New Roman" w:cs="Times New Roman"/>
+          <w:sz w:val="18"/>
+          <w:szCs w:val="18"/>
+        </w:rPr>
+        <w:t xml:space="preserve"> </w:t>
+      </w:r>
+      <w:proofErr w:type="spellStart"/>
+      <w:r>
+        <w:rPr>
+          <w:rFonts w:ascii="Times New Roman" w:hAnsi="Times New Roman" w:cs="Times New Roman"/>
+          <w:sz w:val="18"/>
+          <w:szCs w:val="18"/>
+        </w:rPr>
+        <w:t>name_check</w:t>
+      </w:r>
+      <w:proofErr w:type="spellEnd"/>
+      <w:r>
+        <w:rPr>
+          <w:rFonts w:ascii="Times New Roman" w:hAnsi="Times New Roman" w:cs="Times New Roman"/>
+          <w:sz w:val="18"/>
+          <w:szCs w:val="18"/>
+        </w:rPr>
+        <w:t xml:space="preserve">, </w:t>
+      </w:r>
+      <w:proofErr w:type="spellStart"/>
+      <w:r>
+        <w:rPr>
+          <w:rFonts w:ascii="Times New Roman" w:hAnsi="Times New Roman" w:cs="Times New Roman"/>
+          <w:sz w:val="18"/>
+          <w:szCs w:val="18"/>
+        </w:rPr>
+        <w:t>role_select</w:t>
+      </w:r>
+      <w:proofErr w:type="spellEnd"/>
+    </w:p>
+    <w:p>
+      <w:pPr>
+        <w:pStyle w:val="ListParagraph"/>
+        <w:numPr>
+          <w:ilvl w:val="0"/>
+          <w:numId w:val="8"/>
+        </w:numPr>
+        <w:spacing w:line="480" w:lineRule="auto"/>
+        <w:rPr>
+          <w:rFonts w:ascii="Times New Roman" w:hAnsi="Times New Roman" w:cs="Times New Roman"/>
+          <w:sz w:val="18"/>
+          <w:szCs w:val="18"/>
+        </w:rPr>
+      </w:pPr>
+      <w:proofErr w:type="spellStart"/>
+      <w:r>
+        <w:rPr>
+          <w:rFonts w:ascii="Times New Roman" w:hAnsi="Times New Roman" w:cs="Times New Roman"/>
+          <w:i/>
+          <w:iCs/>
+          <w:sz w:val="18"/>
+          <w:szCs w:val="18"/>
+        </w:rPr>
+        <w:t>n</w:t>
+      </w:r>
+      <w:r>
+        <w:rPr>
+          <w:rFonts w:ascii="Times New Roman" w:hAnsi="Times New Roman" w:cs="Times New Roman"/>
+          <w:i/>
+          <w:iCs/>
+          <w:sz w:val="18"/>
+          <w:szCs w:val="18"/>
+        </w:rPr>
+        <w:t>ame</w:t>
+      </w:r>
+      <w:r>
+        <w:rPr>
+          <w:rFonts w:ascii="Times New Roman" w:hAnsi="Times New Roman" w:cs="Times New Roman"/>
+          <w:i/>
+          <w:iCs/>
+          <w:sz w:val="18"/>
+          <w:szCs w:val="18"/>
+        </w:rPr>
+        <w:t>_check</w:t>
+      </w:r>
+      <w:proofErr w:type="spellEnd"/>
+      <w:r>
+        <w:rPr>
+          <w:rFonts w:ascii="Times New Roman" w:hAnsi="Times New Roman" w:cs="Times New Roman"/>
+          <w:sz w:val="18"/>
+          <w:szCs w:val="18"/>
+        </w:rPr>
+        <w:t xml:space="preserve"> verifies only permitted chara</w:t>
+      </w:r>
+      <w:r>
+        <w:rPr>
+          <w:rFonts w:ascii="Times New Roman" w:hAnsi="Times New Roman" w:cs="Times New Roman"/>
+          <w:sz w:val="18"/>
+          <w:szCs w:val="18"/>
+        </w:rPr>
+        <w:t>c</w:t>
+      </w:r>
+      <w:r>
+        <w:rPr>
+          <w:rFonts w:ascii="Times New Roman" w:hAnsi="Times New Roman" w:cs="Times New Roman"/>
+          <w:sz w:val="18"/>
+          <w:szCs w:val="18"/>
+        </w:rPr>
+        <w:t xml:space="preserve">ters exist in </w:t>
+      </w:r>
+      <w:proofErr w:type="spellStart"/>
+      <w:r>
+        <w:rPr>
+          <w:rFonts w:ascii="Times New Roman" w:hAnsi="Times New Roman" w:cs="Times New Roman"/>
+          <w:i/>
+          <w:iCs/>
+          <w:sz w:val="18"/>
+          <w:szCs w:val="18"/>
+        </w:rPr>
+        <w:t>firstName</w:t>
+      </w:r>
+      <w:proofErr w:type="spellEnd"/>
+      <w:r>
+        <w:rPr>
+          <w:rFonts w:ascii="Times New Roman" w:hAnsi="Times New Roman" w:cs="Times New Roman"/>
+          <w:sz w:val="18"/>
+          <w:szCs w:val="18"/>
+        </w:rPr>
+        <w:t xml:space="preserve"> and </w:t>
+      </w:r>
+      <w:proofErr w:type="spellStart"/>
+      <w:r>
+        <w:rPr>
+          <w:rFonts w:ascii="Times New Roman" w:hAnsi="Times New Roman" w:cs="Times New Roman"/>
+          <w:i/>
+          <w:iCs/>
+          <w:sz w:val="18"/>
+          <w:szCs w:val="18"/>
+        </w:rPr>
+        <w:t>lastName</w:t>
+      </w:r>
+      <w:proofErr w:type="spellEnd"/>
+      <w:r>
+        <w:rPr>
+          <w:rFonts w:ascii="Times New Roman" w:hAnsi="Times New Roman" w:cs="Times New Roman"/>
+          <w:sz w:val="18"/>
+          <w:szCs w:val="18"/>
+        </w:rPr>
+        <w:t xml:space="preserve"> and then stores the input in the appropriate variable/attribute.</w:t>
+      </w:r>
+    </w:p>
+    <w:p>
+      <w:pPr>
+        <w:pStyle w:val="ListParagraph"/>
+        <w:numPr>
+          <w:ilvl w:val="0"/>
+          <w:numId w:val="8"/>
+        </w:numPr>
+        <w:spacing w:line="480" w:lineRule="auto"/>
+        <w:rPr>
+          <w:rFonts w:ascii="Times New Roman" w:hAnsi="Times New Roman" w:cs="Times New Roman"/>
+          <w:sz w:val="18"/>
+          <w:szCs w:val="18"/>
+        </w:rPr>
+      </w:pPr>
+      <w:proofErr w:type="spellStart"/>
+      <w:r>
+        <w:rPr>
+          <w:rFonts w:ascii="Times New Roman" w:hAnsi="Times New Roman" w:cs="Times New Roman"/>
+          <w:i/>
+          <w:iCs/>
+          <w:sz w:val="18"/>
+          <w:szCs w:val="18"/>
+        </w:rPr>
+        <w:t>role_select</w:t>
+      </w:r>
+      <w:proofErr w:type="spellEnd"/>
+      <w:r>
+        <w:rPr>
+          <w:rFonts w:ascii="Times New Roman" w:hAnsi="Times New Roman" w:cs="Times New Roman"/>
+          <w:sz w:val="18"/>
+          <w:szCs w:val="18"/>
+        </w:rPr>
+        <w:t xml:space="preserve"> provides the available positions, allows for selection[/input] and stores the selected input to </w:t>
+      </w:r>
+      <w:r>
+        <w:rPr>
+          <w:rFonts w:ascii="Times New Roman" w:hAnsi="Times New Roman" w:cs="Times New Roman"/>
+          <w:i/>
+          <w:iCs/>
+          <w:sz w:val="18"/>
+          <w:szCs w:val="18"/>
+        </w:rPr>
+        <w:t>role</w:t>
+      </w:r>
+      <w:r>
+        <w:rPr>
+          <w:rFonts w:ascii="Times New Roman" w:hAnsi="Times New Roman" w:cs="Times New Roman"/>
+          <w:sz w:val="18"/>
+          <w:szCs w:val="18"/>
+        </w:rPr>
+        <w:t>.</w:t>
+      </w:r>
+    </w:p>
+    <w:p>
+      <w:pPr>
+        <w:spacing w:line="480" w:lineRule="auto"/>
+        <w:ind w:left="720"/>
+        <w:rPr>
+          <w:rFonts w:ascii="Times New Roman" w:hAnsi="Times New Roman" w:cs="Times New Roman"/>
+          <w:sz w:val="18"/>
+          <w:szCs w:val="18"/>
+        </w:rPr>
+      </w:pPr>
+      <w:proofErr w:type="spellStart"/>
+      <w:r>
+        <w:rPr>
+          <w:rFonts w:ascii="Times New Roman" w:hAnsi="Times New Roman" w:cs="Times New Roman"/>
+          <w:sz w:val="18"/>
+          <w:szCs w:val="18"/>
+        </w:rPr>
+        <w:t>StaffKey</w:t>
+      </w:r>
+      <w:proofErr w:type="spellEnd"/>
+    </w:p>
+    <w:p>
+      <w:pPr>
+        <w:pStyle w:val="ListParagraph"/>
+        <w:numPr>
+          <w:ilvl w:val="0"/>
+          <w:numId w:val="8"/>
+        </w:numPr>
+        <w:spacing w:line="480" w:lineRule="auto"/>
+        <w:rPr>
+          <w:rFonts w:ascii="Times New Roman" w:hAnsi="Times New Roman" w:cs="Times New Roman"/>
+          <w:sz w:val="18"/>
+          <w:szCs w:val="18"/>
+        </w:rPr>
+      </w:pPr>
+      <w:r>
+        <w:rPr>
+          <w:rFonts w:ascii="Times New Roman" w:hAnsi="Times New Roman" w:cs="Times New Roman"/>
+          <w:sz w:val="18"/>
+          <w:szCs w:val="18"/>
+        </w:rPr>
+        <w:t>A private class that stores staff passwords.</w:t>
+      </w:r>
+    </w:p>
+    <w:p>
+      <w:pPr>
+        <w:spacing w:line="480" w:lineRule="auto"/>
+        <w:ind w:left="720"/>
+        <w:rPr>
+          <w:rFonts w:ascii="Times New Roman" w:hAnsi="Times New Roman" w:cs="Times New Roman"/>
+          <w:sz w:val="18"/>
+          <w:szCs w:val="18"/>
+        </w:rPr>
+      </w:pPr>
+      <w:r>
+        <w:rPr>
+          <w:rFonts w:ascii="Times New Roman" w:hAnsi="Times New Roman" w:cs="Times New Roman"/>
+          <w:sz w:val="18"/>
+          <w:szCs w:val="18"/>
+        </w:rPr>
+        <w:tab/>
+      </w:r>
+      <w:r>
+        <w:rPr>
+          <w:rFonts w:ascii="Times New Roman" w:hAnsi="Times New Roman" w:cs="Times New Roman"/>
+          <w:sz w:val="18"/>
+          <w:szCs w:val="18"/>
+          <w:u w:val="single"/>
+        </w:rPr>
+        <w:t>Attributes:</w:t>
+      </w:r>
+      <w:r>
+        <w:rPr>
+          <w:rFonts w:ascii="Times New Roman" w:hAnsi="Times New Roman" w:cs="Times New Roman"/>
+          <w:sz w:val="18"/>
+          <w:szCs w:val="18"/>
+        </w:rPr>
+        <w:t xml:space="preserve"> password</w:t>
+      </w:r>
+      <w:r>
+        <w:rPr>
+          <w:rFonts w:ascii="Times New Roman" w:hAnsi="Times New Roman" w:cs="Times New Roman"/>
+          <w:sz w:val="18"/>
+          <w:szCs w:val="18"/>
+        </w:rPr>
+        <w:t xml:space="preserve"> (</w:t>
+      </w:r>
+      <w:r>
+        <w:rPr>
+          <w:rFonts w:ascii="Times New Roman" w:hAnsi="Times New Roman" w:cs="Times New Roman"/>
+          <w:sz w:val="18"/>
+          <w:szCs w:val="18"/>
+        </w:rPr>
+        <w:t>str</w:t>
+      </w:r>
+      <w:r>
+        <w:rPr>
+          <w:rFonts w:ascii="Times New Roman" w:hAnsi="Times New Roman" w:cs="Times New Roman"/>
+          <w:sz w:val="18"/>
+          <w:szCs w:val="18"/>
+        </w:rPr>
+        <w:t>)</w:t>
+      </w:r>
+    </w:p>
+    <w:p>
+      <w:pPr>
+        <w:spacing w:line="480" w:lineRule="auto"/>
+        <w:ind w:left="720"/>
+        <w:rPr>
+          <w:rFonts w:ascii="Times New Roman" w:hAnsi="Times New Roman" w:cs="Times New Roman"/>
+          <w:sz w:val="18"/>
+          <w:szCs w:val="18"/>
+        </w:rPr>
+      </w:pPr>
+      <w:r>
+        <w:rPr>
+          <w:rFonts w:ascii="Times New Roman" w:hAnsi="Times New Roman" w:cs="Times New Roman"/>
+          <w:sz w:val="18"/>
+          <w:szCs w:val="18"/>
+        </w:rPr>
+        <w:tab/>
+      </w:r>
+      <w:r>
+        <w:rPr>
+          <w:rFonts w:ascii="Times New Roman" w:hAnsi="Times New Roman" w:cs="Times New Roman"/>
+          <w:sz w:val="18"/>
+          <w:szCs w:val="18"/>
+          <w:u w:val="single"/>
+        </w:rPr>
+        <w:t>Functions:</w:t>
+      </w:r>
+      <w:r>
+        <w:rPr>
+          <w:rFonts w:ascii="Times New Roman" w:hAnsi="Times New Roman" w:cs="Times New Roman"/>
+          <w:sz w:val="18"/>
+          <w:szCs w:val="18"/>
+        </w:rPr>
+        <w:t xml:space="preserve"> </w:t>
+      </w:r>
+      <w:proofErr w:type="spellStart"/>
+      <w:r>
+        <w:rPr>
+          <w:rFonts w:ascii="Times New Roman" w:hAnsi="Times New Roman" w:cs="Times New Roman"/>
+          <w:sz w:val="18"/>
+          <w:szCs w:val="18"/>
+        </w:rPr>
+        <w:t>password_chec</w:t>
+      </w:r>
+      <w:r>
+        <w:rPr>
+          <w:rFonts w:ascii="Times New Roman" w:hAnsi="Times New Roman" w:cs="Times New Roman"/>
+          <w:sz w:val="18"/>
+          <w:szCs w:val="18"/>
+        </w:rPr>
+        <w:t>k</w:t>
+      </w:r>
+      <w:proofErr w:type="spellEnd"/>
+    </w:p>
+    <w:p>
+      <w:pPr>
+        <w:spacing w:line="480" w:lineRule="auto"/>
+        <w:ind w:left="720"/>
+        <w:rPr>
+          <w:rFonts w:ascii="Times New Roman" w:hAnsi="Times New Roman" w:cs="Times New Roman"/>
+          <w:sz w:val="18"/>
+          <w:szCs w:val="18"/>
+        </w:rPr>
+      </w:pPr>
+      <w:proofErr w:type="spellStart"/>
+      <w:r>
+        <w:rPr>
+          <w:rFonts w:ascii="Times New Roman" w:hAnsi="Times New Roman" w:cs="Times New Roman"/>
+          <w:sz w:val="18"/>
+          <w:szCs w:val="18"/>
+        </w:rPr>
+        <w:t>UserCheckSignUp</w:t>
+      </w:r>
+      <w:proofErr w:type="spellEnd"/>
+    </w:p>
+    <w:p>
+      <w:pPr>
+        <w:pStyle w:val="ListParagraph"/>
+        <w:numPr>
+          <w:ilvl w:val="0"/>
+          <w:numId w:val="8"/>
+        </w:numPr>
+        <w:spacing w:line="480" w:lineRule="auto"/>
+        <w:rPr>
+          <w:rFonts w:ascii="Times New Roman" w:hAnsi="Times New Roman" w:cs="Times New Roman"/>
+          <w:sz w:val="18"/>
+          <w:szCs w:val="18"/>
+        </w:rPr>
+      </w:pPr>
+      <w:r>
+        <w:rPr>
+          <w:rFonts w:ascii="Times New Roman" w:hAnsi="Times New Roman" w:cs="Times New Roman"/>
+          <w:sz w:val="18"/>
+          <w:szCs w:val="18"/>
+        </w:rPr>
+        <w:t>Verifies that only permitted characters are used to create login information.</w:t>
+      </w:r>
+    </w:p>
+    <w:p>
+      <w:pPr>
+        <w:spacing w:line="480" w:lineRule="auto"/>
+        <w:ind w:left="1440"/>
+        <w:rPr>
+          <w:rFonts w:ascii="Times New Roman" w:hAnsi="Times New Roman" w:cs="Times New Roman"/>
+          <w:sz w:val="18"/>
+          <w:szCs w:val="18"/>
+        </w:rPr>
+      </w:pPr>
+      <w:r>
+        <w:rPr>
+          <w:rFonts w:ascii="Times New Roman" w:hAnsi="Times New Roman" w:cs="Times New Roman"/>
+          <w:sz w:val="18"/>
+          <w:szCs w:val="18"/>
+          <w:u w:val="single"/>
+        </w:rPr>
+        <w:t>Attributes:</w:t>
+      </w:r>
+      <w:r>
+        <w:rPr>
+          <w:rFonts w:ascii="Times New Roman" w:hAnsi="Times New Roman" w:cs="Times New Roman"/>
+          <w:sz w:val="18"/>
+          <w:szCs w:val="18"/>
+        </w:rPr>
+        <w:t xml:space="preserve"> username (</w:t>
+      </w:r>
+      <w:r>
+        <w:rPr>
+          <w:rFonts w:ascii="Times New Roman" w:hAnsi="Times New Roman" w:cs="Times New Roman"/>
+          <w:sz w:val="18"/>
+          <w:szCs w:val="18"/>
+        </w:rPr>
+        <w:t>str</w:t>
+      </w:r>
+      <w:r>
+        <w:rPr>
+          <w:rFonts w:ascii="Times New Roman" w:hAnsi="Times New Roman" w:cs="Times New Roman"/>
+          <w:sz w:val="18"/>
+          <w:szCs w:val="18"/>
+        </w:rPr>
+        <w:t>)</w:t>
+      </w:r>
+    </w:p>
+    <w:p>
+      <w:pPr>
+        <w:spacing w:line="480" w:lineRule="auto"/>
+        <w:ind w:left="1440"/>
+        <w:rPr>
+          <w:rFonts w:ascii="Times New Roman" w:hAnsi="Times New Roman" w:cs="Times New Roman"/>
+          <w:sz w:val="18"/>
+          <w:szCs w:val="18"/>
+        </w:rPr>
+      </w:pPr>
+      <w:r>
+        <w:rPr>
+          <w:rFonts w:ascii="Times New Roman" w:hAnsi="Times New Roman" w:cs="Times New Roman"/>
+          <w:sz w:val="18"/>
+          <w:szCs w:val="18"/>
+        </w:rPr>
+        <w:t xml:space="preserve">Functions: </w:t>
+      </w:r>
+      <w:proofErr w:type="spellStart"/>
+      <w:r>
+        <w:rPr>
+          <w:rFonts w:ascii="Times New Roman" w:hAnsi="Times New Roman" w:cs="Times New Roman"/>
+          <w:sz w:val="18"/>
+          <w:szCs w:val="18"/>
+        </w:rPr>
+        <w:t>username_check</w:t>
+      </w:r>
+      <w:proofErr w:type="spellEnd"/>
+    </w:p>
+    <w:p>
+      <w:pPr>
+        <w:pStyle w:val="ListParagraph"/>
+        <w:numPr>
+          <w:ilvl w:val="0"/>
+          <w:numId w:val="8"/>
+        </w:numPr>
+        <w:spacing w:line="480" w:lineRule="auto"/>
+        <w:rPr>
+          <w:rFonts w:ascii="Times New Roman" w:hAnsi="Times New Roman" w:cs="Times New Roman"/>
+          <w:sz w:val="18"/>
+          <w:szCs w:val="18"/>
+        </w:rPr>
+      </w:pPr>
+      <w:proofErr w:type="spellStart"/>
+      <w:r>
+        <w:rPr>
+          <w:rFonts w:ascii="Times New Roman" w:hAnsi="Times New Roman" w:cs="Times New Roman"/>
+          <w:i/>
+          <w:iCs/>
+          <w:sz w:val="18"/>
+          <w:szCs w:val="18"/>
+        </w:rPr>
+        <w:t>username_check</w:t>
+      </w:r>
+      <w:proofErr w:type="spellEnd"/>
+      <w:r>
+        <w:rPr>
+          <w:rFonts w:ascii="Times New Roman" w:hAnsi="Times New Roman" w:cs="Times New Roman"/>
+          <w:sz w:val="18"/>
+          <w:szCs w:val="18"/>
+        </w:rPr>
+        <w:t xml:space="preserve"> //</w:t>
+      </w:r>
+    </w:p>
+    <w:p>
+      <w:pPr>
+        <w:spacing w:line="480" w:lineRule="auto"/>
+        <w:rPr>
+          <w:rFonts w:ascii="Times New Roman" w:hAnsi="Times New Roman" w:cs="Times New Roman"/>
+          <w:b/>
+          <w:bCs/>
+        </w:rPr>
+      </w:pPr>
+      <w:r>
+        <w:rPr>
+          <w:rFonts w:ascii="Times New Roman" w:hAnsi="Times New Roman" w:cs="Times New Roman"/>
+          <w:b/>
+          <w:bCs/>
+        </w:rPr>
+        <w:t>Lists</w:t>
+      </w:r>
+    </w:p>
+    <w:p>
+      <w:pPr>
+        <w:spacing w:line="480" w:lineRule="auto"/>
+        <w:ind w:firstLine="720"/>
+        <w:rPr>
+          <w:rFonts w:ascii="Times New Roman" w:hAnsi="Times New Roman" w:cs="Times New Roman"/>
+          <w:sz w:val="18"/>
+          <w:szCs w:val="18"/>
+        </w:rPr>
+      </w:pPr>
+      <w:proofErr w:type="spellStart"/>
+      <w:r>
+        <w:rPr>
+          <w:rFonts w:ascii="Times New Roman" w:hAnsi="Times New Roman" w:cs="Times New Roman"/>
+          <w:sz w:val="18"/>
+          <w:szCs w:val="18"/>
+        </w:rPr>
+        <w:t>staff_Usernames</w:t>
+      </w:r>
+      <w:proofErr w:type="spellEnd"/>
+    </w:p>
+    <w:p>
+      <w:pPr>
+        <w:pStyle w:val="ListParagraph"/>
+        <w:numPr>
+          <w:ilvl w:val="0"/>
+          <w:numId w:val="6"/>
+        </w:numPr>
+        <w:spacing w:line="480" w:lineRule="auto"/>
+        <w:rPr>
+          <w:rFonts w:ascii="Times New Roman" w:hAnsi="Times New Roman" w:cs="Times New Roman"/>
+          <w:sz w:val="18"/>
+          <w:szCs w:val="18"/>
+        </w:rPr>
+      </w:pPr>
+      <w:r>
+        <w:rPr>
+          <w:rFonts w:ascii="Times New Roman" w:hAnsi="Times New Roman" w:cs="Times New Roman"/>
+          <w:sz w:val="18"/>
+          <w:szCs w:val="18"/>
+        </w:rPr>
+        <w:t>Stores all staff usernames</w:t>
+      </w:r>
+    </w:p>
+    <w:p>
+      <w:pPr>
+        <w:spacing w:line="480" w:lineRule="auto"/>
+        <w:ind w:firstLine="720"/>
+        <w:rPr>
+          <w:rFonts w:ascii="Times New Roman" w:hAnsi="Times New Roman" w:cs="Times New Roman"/>
+          <w:sz w:val="18"/>
+          <w:szCs w:val="18"/>
+        </w:rPr>
+      </w:pPr>
+      <w:proofErr w:type="spellStart"/>
+      <w:r>
+        <w:rPr>
+          <w:rFonts w:ascii="Times New Roman" w:hAnsi="Times New Roman" w:cs="Times New Roman"/>
+          <w:sz w:val="18"/>
+          <w:szCs w:val="18"/>
+        </w:rPr>
+        <w:lastRenderedPageBreak/>
+        <w:t>staff_</w:t>
+      </w:r>
+      <w:r>
+        <w:rPr>
+          <w:rFonts w:ascii="Times New Roman" w:hAnsi="Times New Roman" w:cs="Times New Roman"/>
+          <w:sz w:val="18"/>
+          <w:szCs w:val="18"/>
+        </w:rPr>
+        <w:t>Passwords</w:t>
+      </w:r>
+      <w:proofErr w:type="spellEnd"/>
+    </w:p>
+    <w:p>
+      <w:pPr>
+        <w:pStyle w:val="ListParagraph"/>
+        <w:numPr>
+          <w:ilvl w:val="0"/>
+          <w:numId w:val="6"/>
+        </w:numPr>
+        <w:spacing w:line="480" w:lineRule="auto"/>
+        <w:rPr>
+          <w:rFonts w:ascii="Times New Roman" w:hAnsi="Times New Roman" w:cs="Times New Roman"/>
+          <w:sz w:val="18"/>
+          <w:szCs w:val="18"/>
+        </w:rPr>
+      </w:pPr>
+      <w:r>
+        <w:rPr>
+          <w:rFonts w:ascii="Times New Roman" w:hAnsi="Times New Roman" w:cs="Times New Roman"/>
+          <w:sz w:val="18"/>
+          <w:szCs w:val="18"/>
+        </w:rPr>
+        <w:t>Stores</w:t>
+      </w:r>
+      <w:r>
+        <w:rPr>
+          <w:rFonts w:ascii="Times New Roman" w:hAnsi="Times New Roman" w:cs="Times New Roman"/>
+          <w:sz w:val="18"/>
+          <w:szCs w:val="18"/>
+        </w:rPr>
+        <w:t xml:space="preserve"> all staff passwords</w:t>
       </w:r>
     </w:p>
     <w:p>
@@ -140,19 +1044,8 @@
           <w:sz w:val="18"/>
           <w:szCs w:val="18"/>
         </w:rPr>
-        <w:t>Checks list for existing username</w:t>
-      </w:r>
-    </w:p>
-    <w:p>
-      <w:pPr>
-        <w:spacing w:line="480" w:lineRule="auto"/>
-        <w:ind w:left="720"/>
-        <w:rPr>
-          <w:rFonts w:ascii="Times New Roman" w:hAnsi="Times New Roman" w:cs="Times New Roman"/>
-          <w:sz w:val="18"/>
-          <w:szCs w:val="18"/>
-        </w:rPr>
-      </w:pPr>
+        <w:t xml:space="preserve">Function of </w:t>
+      </w:r>
       <w:proofErr w:type="spellStart"/>
       <w:r>
         <w:rPr>
@@ -160,69 +1053,17 @@
           <w:sz w:val="18"/>
           <w:szCs w:val="18"/>
         </w:rPr>
-        <w:t>p</w:t>
-      </w:r>
-      <w:r>
-        <w:rPr>
-          <w:rFonts w:ascii="Times New Roman" w:hAnsi="Times New Roman" w:cs="Times New Roman"/>
-          <w:sz w:val="18"/>
-          <w:szCs w:val="18"/>
-        </w:rPr>
-        <w:t>assword</w:t>
-      </w:r>
-      <w:r>
-        <w:rPr>
-          <w:rFonts w:ascii="Times New Roman" w:hAnsi="Times New Roman" w:cs="Times New Roman"/>
-          <w:sz w:val="18"/>
-          <w:szCs w:val="18"/>
-        </w:rPr>
-        <w:t>_check</w:t>
+        <w:t>UserCheck</w:t>
+      </w:r>
+      <w:r>
+        <w:rPr>
+          <w:rFonts w:ascii="Times New Roman" w:hAnsi="Times New Roman" w:cs="Times New Roman"/>
+          <w:sz w:val="18"/>
+          <w:szCs w:val="18"/>
+        </w:rPr>
+        <w:t>SignUp</w:t>
       </w:r>
       <w:proofErr w:type="spellEnd"/>
-      <w:r>
-        <w:rPr>
-          <w:rFonts w:ascii="Times New Roman" w:hAnsi="Times New Roman" w:cs="Times New Roman"/>
-          <w:sz w:val="18"/>
-          <w:szCs w:val="18"/>
-        </w:rPr>
-        <w:t xml:space="preserve"> (</w:t>
-      </w:r>
-      <w:proofErr w:type="spellStart"/>
-      <w:r>
-        <w:rPr>
-          <w:rFonts w:ascii="Times New Roman" w:hAnsi="Times New Roman" w:cs="Times New Roman"/>
-          <w:sz w:val="18"/>
-          <w:szCs w:val="18"/>
-        </w:rPr>
-        <w:t>arg</w:t>
-      </w:r>
-      <w:proofErr w:type="spellEnd"/>
-      <w:r>
-        <w:rPr>
-          <w:rFonts w:ascii="Times New Roman" w:hAnsi="Times New Roman" w:cs="Times New Roman"/>
-          <w:sz w:val="18"/>
-          <w:szCs w:val="18"/>
-        </w:rPr>
-        <w:t xml:space="preserve">: </w:t>
-      </w:r>
-      <w:r>
-        <w:rPr>
-          <w:rFonts w:ascii="Times New Roman" w:hAnsi="Times New Roman" w:cs="Times New Roman"/>
-          <w:i/>
-          <w:iCs/>
-          <w:sz w:val="18"/>
-          <w:szCs w:val="18"/>
-        </w:rPr>
-        <w:t>password</w:t>
-      </w:r>
-      <w:r>
-        <w:rPr>
-          <w:rFonts w:ascii="Times New Roman" w:hAnsi="Times New Roman" w:cs="Times New Roman"/>
-          <w:sz w:val="18"/>
-          <w:szCs w:val="18"/>
-        </w:rPr>
-        <w:t>)</w:t>
-      </w:r>
     </w:p>
     <w:p>
       <w:pPr>
@@ -244,7 +1085,25 @@
           <w:sz w:val="18"/>
           <w:szCs w:val="18"/>
         </w:rPr>
-        <w:t>Verifies min. length of 8 characters</w:t>
+        <w:t xml:space="preserve">Checks </w:t>
+      </w:r>
+      <w:proofErr w:type="spellStart"/>
+      <w:r>
+        <w:rPr>
+          <w:rFonts w:ascii="Times New Roman" w:hAnsi="Times New Roman" w:cs="Times New Roman"/>
+          <w:sz w:val="18"/>
+          <w:szCs w:val="18"/>
+        </w:rPr>
+        <w:t>staff_Usernames</w:t>
+      </w:r>
+      <w:proofErr w:type="spellEnd"/>
+      <w:r>
+        <w:rPr>
+          <w:rFonts w:ascii="Times New Roman" w:hAnsi="Times New Roman" w:cs="Times New Roman"/>
+          <w:sz w:val="18"/>
+          <w:szCs w:val="18"/>
+        </w:rPr>
+        <w:t xml:space="preserve"> for existing username</w:t>
       </w:r>
     </w:p>
     <w:p>
@@ -267,7 +1126,124 @@
           <w:sz w:val="18"/>
           <w:szCs w:val="18"/>
         </w:rPr>
-        <w:t>Verifies max. length of 16 characters</w:t>
+        <w:t xml:space="preserve">Assigns the input to Account object’s </w:t>
+      </w:r>
+      <w:r>
+        <w:rPr>
+          <w:rFonts w:ascii="Times New Roman" w:hAnsi="Times New Roman" w:cs="Times New Roman"/>
+          <w:i/>
+          <w:iCs/>
+          <w:sz w:val="18"/>
+          <w:szCs w:val="18"/>
+        </w:rPr>
+        <w:t>username</w:t>
+      </w:r>
+      <w:r>
+        <w:rPr>
+          <w:rFonts w:ascii="Times New Roman" w:hAnsi="Times New Roman" w:cs="Times New Roman"/>
+          <w:sz w:val="18"/>
+          <w:szCs w:val="18"/>
+        </w:rPr>
+        <w:t xml:space="preserve"> and stores the input in </w:t>
+      </w:r>
+      <w:proofErr w:type="spellStart"/>
+      <w:r>
+        <w:rPr>
+          <w:rFonts w:ascii="Times New Roman" w:hAnsi="Times New Roman" w:cs="Times New Roman"/>
+          <w:sz w:val="18"/>
+          <w:szCs w:val="18"/>
+        </w:rPr>
+        <w:t>staffUsernames</w:t>
+      </w:r>
+      <w:proofErr w:type="spellEnd"/>
+      <w:r>
+        <w:rPr>
+          <w:rFonts w:ascii="Times New Roman" w:hAnsi="Times New Roman" w:cs="Times New Roman"/>
+          <w:sz w:val="18"/>
+          <w:szCs w:val="18"/>
+        </w:rPr>
+        <w:t xml:space="preserve"> (separate)</w:t>
+      </w:r>
+    </w:p>
+    <w:p>
+      <w:pPr>
+        <w:spacing w:line="480" w:lineRule="auto"/>
+        <w:ind w:left="720"/>
+        <w:rPr>
+          <w:rFonts w:ascii="Times New Roman" w:hAnsi="Times New Roman" w:cs="Times New Roman"/>
+          <w:sz w:val="18"/>
+          <w:szCs w:val="18"/>
+        </w:rPr>
+      </w:pPr>
+      <w:proofErr w:type="spellStart"/>
+      <w:r>
+        <w:rPr>
+          <w:rFonts w:ascii="Times New Roman" w:hAnsi="Times New Roman" w:cs="Times New Roman"/>
+          <w:sz w:val="18"/>
+          <w:szCs w:val="18"/>
+        </w:rPr>
+        <w:t>p</w:t>
+      </w:r>
+      <w:r>
+        <w:rPr>
+          <w:rFonts w:ascii="Times New Roman" w:hAnsi="Times New Roman" w:cs="Times New Roman"/>
+          <w:sz w:val="18"/>
+          <w:szCs w:val="18"/>
+        </w:rPr>
+        <w:t>assword</w:t>
+      </w:r>
+      <w:r>
+        <w:rPr>
+          <w:rFonts w:ascii="Times New Roman" w:hAnsi="Times New Roman" w:cs="Times New Roman"/>
+          <w:sz w:val="18"/>
+          <w:szCs w:val="18"/>
+        </w:rPr>
+        <w:t>_check</w:t>
+      </w:r>
+      <w:proofErr w:type="spellEnd"/>
+      <w:r>
+        <w:rPr>
+          <w:rFonts w:ascii="Times New Roman" w:hAnsi="Times New Roman" w:cs="Times New Roman"/>
+          <w:sz w:val="18"/>
+          <w:szCs w:val="18"/>
+        </w:rPr>
+        <w:t xml:space="preserve"> (</w:t>
+      </w:r>
+      <w:proofErr w:type="spellStart"/>
+      <w:r>
+        <w:rPr>
+          <w:rFonts w:ascii="Times New Roman" w:hAnsi="Times New Roman" w:cs="Times New Roman"/>
+          <w:sz w:val="18"/>
+          <w:szCs w:val="18"/>
+        </w:rPr>
+        <w:t>arg</w:t>
+      </w:r>
+      <w:proofErr w:type="spellEnd"/>
+      <w:r>
+        <w:rPr>
+          <w:rFonts w:ascii="Times New Roman" w:hAnsi="Times New Roman" w:cs="Times New Roman"/>
+          <w:sz w:val="18"/>
+          <w:szCs w:val="18"/>
+        </w:rPr>
+        <w:t xml:space="preserve">: </w:t>
+      </w:r>
+      <w:r>
+        <w:rPr>
+          <w:rFonts w:ascii="Times New Roman" w:hAnsi="Times New Roman" w:cs="Times New Roman"/>
+          <w:i/>
+          <w:iCs/>
+          <w:sz w:val="18"/>
+          <w:szCs w:val="18"/>
+        </w:rPr>
+        <w:t>password</w:t>
+      </w:r>
+      <w:r>
+        <w:rPr>
+          <w:rFonts w:ascii="Times New Roman" w:hAnsi="Times New Roman" w:cs="Times New Roman"/>
+          <w:sz w:val="18"/>
+          <w:szCs w:val="18"/>
+        </w:rPr>
+        <w:t>)</w:t>
       </w:r>
     </w:p>
     <w:p>
@@ -284,23 +1260,13 @@
           <w:szCs w:val="18"/>
         </w:rPr>
       </w:pPr>
-      <w:proofErr w:type="spellStart"/>
-      <w:r>
-        <w:rPr>
-          <w:rFonts w:ascii="Times New Roman" w:hAnsi="Times New Roman" w:cs="Times New Roman"/>
-          <w:sz w:val="18"/>
-          <w:szCs w:val="18"/>
-        </w:rPr>
-        <w:t>Verfies</w:t>
-      </w:r>
-      <w:proofErr w:type="spellEnd"/>
-      <w:r>
-        <w:rPr>
-          <w:rFonts w:ascii="Times New Roman" w:hAnsi="Times New Roman" w:cs="Times New Roman"/>
-          <w:sz w:val="18"/>
-          <w:szCs w:val="18"/>
-        </w:rPr>
-        <w:t xml:space="preserve"> at least 1 uppercase letter</w:t>
+      <w:r>
+        <w:rPr>
+          <w:rFonts w:ascii="Times New Roman" w:hAnsi="Times New Roman" w:cs="Times New Roman"/>
+          <w:sz w:val="18"/>
+          <w:szCs w:val="18"/>
+        </w:rPr>
+        <w:t>Verifies min. length of 8 characters</w:t>
       </w:r>
     </w:p>
     <w:p>
@@ -323,7 +1289,7 @@
           <w:sz w:val="18"/>
           <w:szCs w:val="18"/>
         </w:rPr>
-        <w:t>Verifies at least 1 lowercase letter</w:t>
+        <w:t>Verifies max. length of 16 characters</w:t>
       </w:r>
     </w:p>
     <w:p>
@@ -340,13 +1306,23 @@
           <w:szCs w:val="18"/>
         </w:rPr>
       </w:pPr>
-      <w:r>
-        <w:rPr>
-          <w:rFonts w:ascii="Times New Roman" w:hAnsi="Times New Roman" w:cs="Times New Roman"/>
-          <w:sz w:val="18"/>
-          <w:szCs w:val="18"/>
-        </w:rPr>
-        <w:t>Verifies at least 1 number</w:t>
+      <w:proofErr w:type="spellStart"/>
+      <w:r>
+        <w:rPr>
+          <w:rFonts w:ascii="Times New Roman" w:hAnsi="Times New Roman" w:cs="Times New Roman"/>
+          <w:sz w:val="18"/>
+          <w:szCs w:val="18"/>
+        </w:rPr>
+        <w:t>Verfies</w:t>
+      </w:r>
+      <w:proofErr w:type="spellEnd"/>
+      <w:r>
+        <w:rPr>
+          <w:rFonts w:ascii="Times New Roman" w:hAnsi="Times New Roman" w:cs="Times New Roman"/>
+          <w:sz w:val="18"/>
+          <w:szCs w:val="18"/>
+        </w:rPr>
+        <w:t xml:space="preserve"> at least 1 uppercase letter</w:t>
       </w:r>
     </w:p>
     <w:p>
@@ -369,7 +1345,7 @@
           <w:sz w:val="18"/>
           <w:szCs w:val="18"/>
         </w:rPr>
-        <w:t>Verifies no inclusion of whitespace</w:t>
+        <w:t>Verifies at least 1 lowercase letter</w:t>
       </w:r>
     </w:p>
     <w:p>
@@ -392,122 +1368,7 @@
           <w:sz w:val="18"/>
           <w:szCs w:val="18"/>
         </w:rPr>
-        <w:t xml:space="preserve">Verifies no section/sequence matches </w:t>
-      </w:r>
-      <w:proofErr w:type="spellStart"/>
-      <w:r>
-        <w:rPr>
-          <w:rFonts w:ascii="Times New Roman" w:hAnsi="Times New Roman" w:cs="Times New Roman"/>
-          <w:i/>
-          <w:iCs/>
-          <w:sz w:val="18"/>
-          <w:szCs w:val="18"/>
-        </w:rPr>
-        <w:t>first_name</w:t>
-      </w:r>
-      <w:proofErr w:type="spellEnd"/>
-      <w:r>
-        <w:rPr>
-          <w:rFonts w:ascii="Times New Roman" w:hAnsi="Times New Roman" w:cs="Times New Roman"/>
-          <w:sz w:val="18"/>
-          <w:szCs w:val="18"/>
-        </w:rPr>
-        <w:t xml:space="preserve"> attribute</w:t>
-      </w:r>
-    </w:p>
-    <w:p>
-      <w:pPr>
-        <w:spacing w:line="480" w:lineRule="auto"/>
-        <w:ind w:left="720"/>
-        <w:rPr>
-          <w:rFonts w:ascii="Times New Roman" w:hAnsi="Times New Roman" w:cs="Times New Roman"/>
-          <w:sz w:val="18"/>
-          <w:szCs w:val="18"/>
-        </w:rPr>
-      </w:pPr>
-      <w:proofErr w:type="spellStart"/>
-      <w:r>
-        <w:rPr>
-          <w:rFonts w:ascii="Times New Roman" w:hAnsi="Times New Roman" w:cs="Times New Roman"/>
-          <w:sz w:val="18"/>
-          <w:szCs w:val="18"/>
-        </w:rPr>
-        <w:t>name_</w:t>
-      </w:r>
-      <w:r>
-        <w:rPr>
-          <w:rFonts w:ascii="Times New Roman" w:hAnsi="Times New Roman" w:cs="Times New Roman"/>
-          <w:sz w:val="18"/>
-          <w:szCs w:val="18"/>
-        </w:rPr>
-        <w:t>check</w:t>
-      </w:r>
-      <w:proofErr w:type="spellEnd"/>
-      <w:r>
-        <w:rPr>
-          <w:rFonts w:ascii="Times New Roman" w:hAnsi="Times New Roman" w:cs="Times New Roman"/>
-          <w:sz w:val="18"/>
-          <w:szCs w:val="18"/>
-        </w:rPr>
-        <w:t xml:space="preserve"> (</w:t>
-      </w:r>
-      <w:proofErr w:type="spellStart"/>
-      <w:r>
-        <w:rPr>
-          <w:rFonts w:ascii="Times New Roman" w:hAnsi="Times New Roman" w:cs="Times New Roman"/>
-          <w:sz w:val="18"/>
-          <w:szCs w:val="18"/>
-        </w:rPr>
-        <w:t>args</w:t>
-      </w:r>
-      <w:proofErr w:type="spellEnd"/>
-      <w:r>
-        <w:rPr>
-          <w:rFonts w:ascii="Times New Roman" w:hAnsi="Times New Roman" w:cs="Times New Roman"/>
-          <w:sz w:val="18"/>
-          <w:szCs w:val="18"/>
-        </w:rPr>
-        <w:t xml:space="preserve">: </w:t>
-      </w:r>
-      <w:proofErr w:type="spellStart"/>
-      <w:r>
-        <w:rPr>
-          <w:rFonts w:ascii="Times New Roman" w:hAnsi="Times New Roman" w:cs="Times New Roman"/>
-          <w:i/>
-          <w:iCs/>
-          <w:sz w:val="18"/>
-          <w:szCs w:val="18"/>
-        </w:rPr>
-        <w:t>first_name</w:t>
-      </w:r>
-      <w:proofErr w:type="spellEnd"/>
-      <w:r>
-        <w:rPr>
-          <w:rFonts w:ascii="Times New Roman" w:hAnsi="Times New Roman" w:cs="Times New Roman"/>
-          <w:sz w:val="18"/>
-          <w:szCs w:val="18"/>
-        </w:rPr>
-        <w:t xml:space="preserve">, </w:t>
-      </w:r>
-      <w:proofErr w:type="spellStart"/>
-      <w:r>
-        <w:rPr>
-          <w:rFonts w:ascii="Times New Roman" w:hAnsi="Times New Roman" w:cs="Times New Roman"/>
-          <w:i/>
-          <w:iCs/>
-          <w:sz w:val="18"/>
-          <w:szCs w:val="18"/>
-        </w:rPr>
-        <w:t>last_name</w:t>
-      </w:r>
-      <w:proofErr w:type="spellEnd"/>
-      <w:r>
-        <w:rPr>
-          <w:rFonts w:ascii="Times New Roman" w:hAnsi="Times New Roman" w:cs="Times New Roman"/>
-          <w:sz w:val="18"/>
-          <w:szCs w:val="18"/>
-        </w:rPr>
-        <w:t>)</w:t>
+        <w:t>Verifies at least 1 number</w:t>
       </w:r>
     </w:p>
     <w:p>
@@ -530,25 +1391,7 @@
           <w:sz w:val="18"/>
           <w:szCs w:val="18"/>
         </w:rPr>
-        <w:t xml:space="preserve">Valid input: letters, diacritic letters, </w:t>
-      </w:r>
-      <w:proofErr w:type="spellStart"/>
-      <w:r>
-        <w:rPr>
-          <w:rFonts w:ascii="Times New Roman" w:hAnsi="Times New Roman" w:cs="Times New Roman"/>
-          <w:sz w:val="18"/>
-          <w:szCs w:val="18"/>
-        </w:rPr>
-        <w:t>hypen</w:t>
-      </w:r>
-      <w:proofErr w:type="spellEnd"/>
-      <w:r>
-        <w:rPr>
-          <w:rFonts w:ascii="Times New Roman" w:hAnsi="Times New Roman" w:cs="Times New Roman"/>
-          <w:sz w:val="18"/>
-          <w:szCs w:val="18"/>
-        </w:rPr>
-        <w:t>, apostrophe</w:t>
+        <w:t>Verifies no inclusion of whitespace</w:t>
       </w:r>
     </w:p>
     <w:p>
@@ -571,29 +1414,28 @@
           <w:sz w:val="18"/>
           <w:szCs w:val="18"/>
         </w:rPr>
-        <w:t>Removes any whitespace</w:t>
-      </w:r>
-    </w:p>
-    <w:p>
-      <w:pPr>
-        <w:spacing w:line="480" w:lineRule="auto"/>
-        <w:ind w:left="720"/>
-        <w:rPr>
-          <w:rFonts w:ascii="Times New Roman" w:hAnsi="Times New Roman" w:cs="Times New Roman"/>
-          <w:sz w:val="18"/>
-          <w:szCs w:val="18"/>
-        </w:rPr>
-      </w:pPr>
+        <w:t xml:space="preserve">Verifies no section/sequence matches </w:t>
+      </w:r>
       <w:proofErr w:type="spellStart"/>
       <w:r>
         <w:rPr>
           <w:rFonts w:ascii="Times New Roman" w:hAnsi="Times New Roman" w:cs="Times New Roman"/>
-          <w:sz w:val="18"/>
-          <w:szCs w:val="18"/>
-        </w:rPr>
-        <w:t>role_select</w:t>
+          <w:i/>
+          <w:iCs/>
+          <w:sz w:val="18"/>
+          <w:szCs w:val="18"/>
+        </w:rPr>
+        <w:t>first_name</w:t>
       </w:r>
       <w:proofErr w:type="spellEnd"/>
+      <w:r>
+        <w:rPr>
+          <w:rFonts w:ascii="Times New Roman" w:hAnsi="Times New Roman" w:cs="Times New Roman"/>
+          <w:sz w:val="18"/>
+          <w:szCs w:val="18"/>
+        </w:rPr>
+        <w:t xml:space="preserve"> attribute</w:t>
+      </w:r>
     </w:p>
     <w:p>
       <w:pPr>
@@ -615,6 +1457,271 @@
           <w:sz w:val="18"/>
           <w:szCs w:val="18"/>
         </w:rPr>
+        <w:t xml:space="preserve">Assigns the input to </w:t>
+      </w:r>
+      <w:proofErr w:type="spellStart"/>
+      <w:r>
+        <w:rPr>
+          <w:rFonts w:ascii="Times New Roman" w:hAnsi="Times New Roman" w:cs="Times New Roman"/>
+          <w:sz w:val="18"/>
+          <w:szCs w:val="18"/>
+        </w:rPr>
+        <w:t>StaffKey</w:t>
+      </w:r>
+      <w:proofErr w:type="spellEnd"/>
+      <w:r>
+        <w:rPr>
+          <w:rFonts w:ascii="Times New Roman" w:hAnsi="Times New Roman" w:cs="Times New Roman"/>
+          <w:sz w:val="18"/>
+          <w:szCs w:val="18"/>
+        </w:rPr>
+        <w:t xml:space="preserve"> object’s </w:t>
+      </w:r>
+      <w:r>
+        <w:rPr>
+          <w:rFonts w:ascii="Times New Roman" w:hAnsi="Times New Roman" w:cs="Times New Roman"/>
+          <w:i/>
+          <w:iCs/>
+          <w:sz w:val="18"/>
+          <w:szCs w:val="18"/>
+        </w:rPr>
+        <w:t>password</w:t>
+      </w:r>
+      <w:r>
+        <w:rPr>
+          <w:rFonts w:ascii="Times New Roman" w:hAnsi="Times New Roman" w:cs="Times New Roman"/>
+          <w:sz w:val="18"/>
+          <w:szCs w:val="18"/>
+        </w:rPr>
+        <w:t xml:space="preserve">. Object is then stored in </w:t>
+      </w:r>
+      <w:proofErr w:type="spellStart"/>
+      <w:r>
+        <w:rPr>
+          <w:rFonts w:ascii="Times New Roman" w:hAnsi="Times New Roman" w:cs="Times New Roman"/>
+          <w:sz w:val="18"/>
+          <w:szCs w:val="18"/>
+        </w:rPr>
+        <w:t>staff_Passwords</w:t>
+      </w:r>
+      <w:proofErr w:type="spellEnd"/>
+    </w:p>
+    <w:p>
+      <w:pPr>
+        <w:spacing w:line="480" w:lineRule="auto"/>
+        <w:ind w:left="720"/>
+        <w:rPr>
+          <w:rFonts w:ascii="Times New Roman" w:hAnsi="Times New Roman" w:cs="Times New Roman"/>
+          <w:sz w:val="18"/>
+          <w:szCs w:val="18"/>
+        </w:rPr>
+      </w:pPr>
+      <w:proofErr w:type="spellStart"/>
+      <w:r>
+        <w:rPr>
+          <w:rFonts w:ascii="Times New Roman" w:hAnsi="Times New Roman" w:cs="Times New Roman"/>
+          <w:sz w:val="18"/>
+          <w:szCs w:val="18"/>
+        </w:rPr>
+        <w:t>name_</w:t>
+      </w:r>
+      <w:r>
+        <w:rPr>
+          <w:rFonts w:ascii="Times New Roman" w:hAnsi="Times New Roman" w:cs="Times New Roman"/>
+          <w:sz w:val="18"/>
+          <w:szCs w:val="18"/>
+        </w:rPr>
+        <w:t>check</w:t>
+      </w:r>
+      <w:proofErr w:type="spellEnd"/>
+      <w:r>
+        <w:rPr>
+          <w:rFonts w:ascii="Times New Roman" w:hAnsi="Times New Roman" w:cs="Times New Roman"/>
+          <w:sz w:val="18"/>
+          <w:szCs w:val="18"/>
+        </w:rPr>
+        <w:t xml:space="preserve"> (</w:t>
+      </w:r>
+      <w:proofErr w:type="spellStart"/>
+      <w:r>
+        <w:rPr>
+          <w:rFonts w:ascii="Times New Roman" w:hAnsi="Times New Roman" w:cs="Times New Roman"/>
+          <w:sz w:val="18"/>
+          <w:szCs w:val="18"/>
+        </w:rPr>
+        <w:t>args</w:t>
+      </w:r>
+      <w:proofErr w:type="spellEnd"/>
+      <w:r>
+        <w:rPr>
+          <w:rFonts w:ascii="Times New Roman" w:hAnsi="Times New Roman" w:cs="Times New Roman"/>
+          <w:sz w:val="18"/>
+          <w:szCs w:val="18"/>
+        </w:rPr>
+        <w:t xml:space="preserve">: </w:t>
+      </w:r>
+      <w:proofErr w:type="spellStart"/>
+      <w:r>
+        <w:rPr>
+          <w:rFonts w:ascii="Times New Roman" w:hAnsi="Times New Roman" w:cs="Times New Roman"/>
+          <w:i/>
+          <w:iCs/>
+          <w:sz w:val="18"/>
+          <w:szCs w:val="18"/>
+        </w:rPr>
+        <w:t>first_name</w:t>
+      </w:r>
+      <w:proofErr w:type="spellEnd"/>
+      <w:r>
+        <w:rPr>
+          <w:rFonts w:ascii="Times New Roman" w:hAnsi="Times New Roman" w:cs="Times New Roman"/>
+          <w:sz w:val="18"/>
+          <w:szCs w:val="18"/>
+        </w:rPr>
+        <w:t xml:space="preserve">, </w:t>
+      </w:r>
+      <w:proofErr w:type="spellStart"/>
+      <w:r>
+        <w:rPr>
+          <w:rFonts w:ascii="Times New Roman" w:hAnsi="Times New Roman" w:cs="Times New Roman"/>
+          <w:i/>
+          <w:iCs/>
+          <w:sz w:val="18"/>
+          <w:szCs w:val="18"/>
+        </w:rPr>
+        <w:t>last_name</w:t>
+      </w:r>
+      <w:proofErr w:type="spellEnd"/>
+      <w:r>
+        <w:rPr>
+          <w:rFonts w:ascii="Times New Roman" w:hAnsi="Times New Roman" w:cs="Times New Roman"/>
+          <w:sz w:val="18"/>
+          <w:szCs w:val="18"/>
+        </w:rPr>
+        <w:t>)</w:t>
+      </w:r>
+    </w:p>
+    <w:p>
+      <w:pPr>
+        <w:pStyle w:val="ListParagraph"/>
+        <w:numPr>
+          <w:ilvl w:val="0"/>
+          <w:numId w:val="4"/>
+        </w:numPr>
+        <w:spacing w:line="480" w:lineRule="auto"/>
+        <w:rPr>
+          <w:rFonts w:ascii="Times New Roman" w:hAnsi="Times New Roman" w:cs="Times New Roman"/>
+          <w:sz w:val="18"/>
+          <w:szCs w:val="18"/>
+        </w:rPr>
+      </w:pPr>
+      <w:r>
+        <w:rPr>
+          <w:rFonts w:ascii="Times New Roman" w:hAnsi="Times New Roman" w:cs="Times New Roman"/>
+          <w:sz w:val="18"/>
+          <w:szCs w:val="18"/>
+        </w:rPr>
+        <w:t xml:space="preserve">Valid input: letters, diacritic letters, </w:t>
+      </w:r>
+      <w:proofErr w:type="gramStart"/>
+      <w:r>
+        <w:rPr>
+          <w:rFonts w:ascii="Times New Roman" w:hAnsi="Times New Roman" w:cs="Times New Roman"/>
+          <w:sz w:val="18"/>
+          <w:szCs w:val="18"/>
+        </w:rPr>
+        <w:t>hyp</w:t>
+      </w:r>
+      <w:r>
+        <w:rPr>
+          <w:rFonts w:ascii="Times New Roman" w:hAnsi="Times New Roman" w:cs="Times New Roman"/>
+          <w:sz w:val="18"/>
+          <w:szCs w:val="18"/>
+        </w:rPr>
+        <w:t>h</w:t>
+      </w:r>
+      <w:r>
+        <w:rPr>
+          <w:rFonts w:ascii="Times New Roman" w:hAnsi="Times New Roman" w:cs="Times New Roman"/>
+          <w:sz w:val="18"/>
+          <w:szCs w:val="18"/>
+        </w:rPr>
+        <w:t>en</w:t>
+      </w:r>
+      <w:proofErr w:type="gramEnd"/>
+      <w:r>
+        <w:rPr>
+          <w:rFonts w:ascii="Times New Roman" w:hAnsi="Times New Roman" w:cs="Times New Roman"/>
+          <w:sz w:val="18"/>
+          <w:szCs w:val="18"/>
+        </w:rPr>
+        <w:t>, apostrophe</w:t>
+      </w:r>
+    </w:p>
+    <w:p>
+      <w:pPr>
+        <w:pStyle w:val="ListParagraph"/>
+        <w:numPr>
+          <w:ilvl w:val="0"/>
+          <w:numId w:val="4"/>
+        </w:numPr>
+        <w:spacing w:line="480" w:lineRule="auto"/>
+        <w:rPr>
+          <w:rFonts w:ascii="Times New Roman" w:hAnsi="Times New Roman" w:cs="Times New Roman"/>
+          <w:sz w:val="18"/>
+          <w:szCs w:val="18"/>
+        </w:rPr>
+      </w:pPr>
+      <w:r>
+        <w:rPr>
+          <w:rFonts w:ascii="Times New Roman" w:hAnsi="Times New Roman" w:cs="Times New Roman"/>
+          <w:sz w:val="18"/>
+          <w:szCs w:val="18"/>
+        </w:rPr>
+        <w:t>Removes any whitespace</w:t>
+      </w:r>
+    </w:p>
+    <w:p>
+      <w:pPr>
+        <w:spacing w:line="480" w:lineRule="auto"/>
+        <w:ind w:left="720"/>
+        <w:rPr>
+          <w:rFonts w:ascii="Times New Roman" w:hAnsi="Times New Roman" w:cs="Times New Roman"/>
+          <w:sz w:val="18"/>
+          <w:szCs w:val="18"/>
+        </w:rPr>
+      </w:pPr>
+      <w:proofErr w:type="spellStart"/>
+      <w:r>
+        <w:rPr>
+          <w:rFonts w:ascii="Times New Roman" w:hAnsi="Times New Roman" w:cs="Times New Roman"/>
+          <w:sz w:val="18"/>
+          <w:szCs w:val="18"/>
+        </w:rPr>
+        <w:t>role_select</w:t>
+      </w:r>
+      <w:proofErr w:type="spellEnd"/>
+    </w:p>
+    <w:p>
+      <w:pPr>
+        <w:pStyle w:val="ListParagraph"/>
+        <w:numPr>
+          <w:ilvl w:val="0"/>
+          <w:numId w:val="4"/>
+        </w:numPr>
+        <w:spacing w:line="480" w:lineRule="auto"/>
+        <w:rPr>
+          <w:rFonts w:ascii="Times New Roman" w:hAnsi="Times New Roman" w:cs="Times New Roman"/>
+          <w:sz w:val="18"/>
+          <w:szCs w:val="18"/>
+        </w:rPr>
+      </w:pPr>
+      <w:r>
+        <w:rPr>
+          <w:rFonts w:ascii="Times New Roman" w:hAnsi="Times New Roman" w:cs="Times New Roman"/>
+          <w:sz w:val="18"/>
+          <w:szCs w:val="18"/>
+        </w:rPr>
         <w:t xml:space="preserve">Displays role options to user (Manager, Busboy, </w:t>
       </w:r>
       <w:r>
@@ -668,6 +1775,496 @@
         </w:rPr>
         <w:tab/>
       </w:r>
+      <w:proofErr w:type="gramStart"/>
+      <w:r>
+        <w:rPr>
+          <w:rFonts w:ascii="Times New Roman" w:hAnsi="Times New Roman" w:cs="Times New Roman"/>
+          <w:sz w:val="18"/>
+          <w:szCs w:val="18"/>
+        </w:rPr>
+        <w:t>Login :</w:t>
+      </w:r>
+      <w:proofErr w:type="gramEnd"/>
+      <w:r>
+        <w:rPr>
+          <w:rFonts w:ascii="Times New Roman" w:hAnsi="Times New Roman" w:cs="Times New Roman"/>
+          <w:sz w:val="18"/>
+          <w:szCs w:val="18"/>
+        </w:rPr>
+        <w:t xml:space="preserve"> Text Spaces</w:t>
+      </w:r>
+    </w:p>
+    <w:p>
+      <w:pPr>
+        <w:pStyle w:val="ListParagraph"/>
+        <w:numPr>
+          <w:ilvl w:val="0"/>
+          <w:numId w:val="4"/>
+        </w:numPr>
+        <w:rPr>
+          <w:rFonts w:ascii="Times New Roman" w:hAnsi="Times New Roman" w:cs="Times New Roman"/>
+          <w:sz w:val="18"/>
+          <w:szCs w:val="18"/>
+        </w:rPr>
+      </w:pPr>
+      <w:r>
+        <w:rPr>
+          <w:rFonts w:ascii="Times New Roman" w:hAnsi="Times New Roman" w:cs="Times New Roman"/>
+          <w:sz w:val="18"/>
+          <w:szCs w:val="18"/>
+        </w:rPr>
+        <w:t>User clicks on the username bar and enters their assigned username.</w:t>
+      </w:r>
+    </w:p>
+    <w:p>
+      <w:pPr>
+        <w:pStyle w:val="ListParagraph"/>
+        <w:numPr>
+          <w:ilvl w:val="0"/>
+          <w:numId w:val="4"/>
+        </w:numPr>
+        <w:rPr>
+          <w:rFonts w:ascii="Times New Roman" w:hAnsi="Times New Roman" w:cs="Times New Roman"/>
+          <w:sz w:val="18"/>
+          <w:szCs w:val="18"/>
+        </w:rPr>
+      </w:pPr>
+      <w:r>
+        <w:rPr>
+          <w:rFonts w:ascii="Times New Roman" w:hAnsi="Times New Roman" w:cs="Times New Roman"/>
+          <w:sz w:val="18"/>
+          <w:szCs w:val="18"/>
+        </w:rPr>
+        <w:t>User clicks on the password bar and enters their chosen password. As the user enters text into this bar, each character is displayed as an asterisk (</w:t>
+      </w:r>
+      <w:proofErr w:type="spellStart"/>
+      <w:r>
+        <w:rPr>
+          <w:rFonts w:ascii="Times New Roman" w:hAnsi="Times New Roman" w:cs="Times New Roman"/>
+          <w:sz w:val="18"/>
+          <w:szCs w:val="18"/>
+        </w:rPr>
+        <w:t>eg.</w:t>
+      </w:r>
+      <w:proofErr w:type="spellEnd"/>
+      <w:r>
+        <w:rPr>
+          <w:rFonts w:ascii="Times New Roman" w:hAnsi="Times New Roman" w:cs="Times New Roman"/>
+          <w:sz w:val="18"/>
+          <w:szCs w:val="18"/>
+        </w:rPr>
+        <w:t xml:space="preserve"> Fake_passW0910 shows as **************). This encryption is a security measure.</w:t>
+      </w:r>
+    </w:p>
+    <w:p>
+      <w:pPr>
+        <w:rPr>
+          <w:rFonts w:ascii="Times New Roman" w:hAnsi="Times New Roman" w:cs="Times New Roman"/>
+          <w:sz w:val="18"/>
+          <w:szCs w:val="18"/>
+        </w:rPr>
+      </w:pPr>
+      <w:r>
+        <w:rPr>
+          <w:rFonts w:ascii="Times New Roman" w:hAnsi="Times New Roman" w:cs="Times New Roman"/>
+          <w:sz w:val="18"/>
+          <w:szCs w:val="18"/>
+        </w:rPr>
+        <w:lastRenderedPageBreak/>
+        <w:tab/>
+      </w:r>
+      <w:proofErr w:type="gramStart"/>
+      <w:r>
+        <w:rPr>
+          <w:rFonts w:ascii="Times New Roman" w:hAnsi="Times New Roman" w:cs="Times New Roman"/>
+          <w:sz w:val="18"/>
+          <w:szCs w:val="18"/>
+        </w:rPr>
+        <w:t>Login :</w:t>
+      </w:r>
+      <w:proofErr w:type="gramEnd"/>
+      <w:r>
+        <w:rPr>
+          <w:rFonts w:ascii="Times New Roman" w:hAnsi="Times New Roman" w:cs="Times New Roman"/>
+          <w:sz w:val="18"/>
+          <w:szCs w:val="18"/>
+        </w:rPr>
+        <w:t xml:space="preserve"> Buttons</w:t>
+      </w:r>
+    </w:p>
+    <w:p>
+      <w:pPr>
+        <w:pStyle w:val="ListParagraph"/>
+        <w:numPr>
+          <w:ilvl w:val="0"/>
+          <w:numId w:val="4"/>
+        </w:numPr>
+        <w:rPr>
+          <w:rFonts w:ascii="Times New Roman" w:hAnsi="Times New Roman" w:cs="Times New Roman"/>
+          <w:sz w:val="18"/>
+          <w:szCs w:val="18"/>
+        </w:rPr>
+      </w:pPr>
+      <w:r>
+        <w:rPr>
+          <w:rFonts w:ascii="Times New Roman" w:hAnsi="Times New Roman" w:cs="Times New Roman"/>
+          <w:sz w:val="18"/>
+          <w:szCs w:val="18"/>
+        </w:rPr>
+        <w:t xml:space="preserve">After providing input for both the username and password, the user clicks the </w:t>
+      </w:r>
+      <w:r>
+        <w:rPr>
+          <w:rFonts w:ascii="Times New Roman" w:hAnsi="Times New Roman" w:cs="Times New Roman"/>
+          <w:sz w:val="18"/>
+          <w:szCs w:val="18"/>
+        </w:rPr>
+        <w:t>“</w:t>
+      </w:r>
+      <w:r>
+        <w:rPr>
+          <w:rFonts w:ascii="Times New Roman" w:hAnsi="Times New Roman" w:cs="Times New Roman"/>
+          <w:sz w:val="18"/>
+          <w:szCs w:val="18"/>
+        </w:rPr>
+        <w:t>Submit</w:t>
+      </w:r>
+      <w:r>
+        <w:rPr>
+          <w:rFonts w:ascii="Times New Roman" w:hAnsi="Times New Roman" w:cs="Times New Roman"/>
+          <w:sz w:val="18"/>
+          <w:szCs w:val="18"/>
+        </w:rPr>
+        <w:t>”</w:t>
+      </w:r>
+      <w:r>
+        <w:rPr>
+          <w:rFonts w:ascii="Times New Roman" w:hAnsi="Times New Roman" w:cs="Times New Roman"/>
+          <w:sz w:val="18"/>
+          <w:szCs w:val="18"/>
+        </w:rPr>
+        <w:t xml:space="preserve"> button, which passes both inputs to the appropriate functions to deter</w:t>
+      </w:r>
+      <w:r>
+        <w:rPr>
+          <w:rFonts w:ascii="Times New Roman" w:hAnsi="Times New Roman" w:cs="Times New Roman"/>
+          <w:sz w:val="18"/>
+          <w:szCs w:val="18"/>
+        </w:rPr>
+        <w:t xml:space="preserve">mine </w:t>
+      </w:r>
+      <w:r>
+        <w:rPr>
+          <w:rFonts w:ascii="Times New Roman" w:hAnsi="Times New Roman" w:cs="Times New Roman"/>
+          <w:sz w:val="18"/>
+          <w:szCs w:val="18"/>
+        </w:rPr>
+        <w:t>if</w:t>
+      </w:r>
+      <w:r>
+        <w:rPr>
+          <w:rFonts w:ascii="Times New Roman" w:hAnsi="Times New Roman" w:cs="Times New Roman"/>
+          <w:sz w:val="18"/>
+          <w:szCs w:val="18"/>
+        </w:rPr>
+        <w:t xml:space="preserve"> they are valid. If both the username and password are validated, the user’s </w:t>
+      </w:r>
+      <w:r>
+        <w:rPr>
+          <w:rFonts w:ascii="Times New Roman" w:hAnsi="Times New Roman" w:cs="Times New Roman"/>
+          <w:i/>
+          <w:iCs/>
+          <w:sz w:val="18"/>
+          <w:szCs w:val="18"/>
+        </w:rPr>
+        <w:t>role</w:t>
+      </w:r>
+      <w:r>
+        <w:rPr>
+          <w:rFonts w:ascii="Times New Roman" w:hAnsi="Times New Roman" w:cs="Times New Roman"/>
+          <w:sz w:val="18"/>
+          <w:szCs w:val="18"/>
+        </w:rPr>
+        <w:t xml:space="preserve"> is </w:t>
+      </w:r>
+      <w:r>
+        <w:rPr>
+          <w:rFonts w:ascii="Times New Roman" w:hAnsi="Times New Roman" w:cs="Times New Roman"/>
+          <w:sz w:val="18"/>
+          <w:szCs w:val="18"/>
+        </w:rPr>
+        <w:t>checked,</w:t>
+      </w:r>
+      <w:r>
+        <w:rPr>
+          <w:rFonts w:ascii="Times New Roman" w:hAnsi="Times New Roman" w:cs="Times New Roman"/>
+          <w:sz w:val="18"/>
+          <w:szCs w:val="18"/>
+        </w:rPr>
+        <w:t xml:space="preserve"> and the user is sent to the appropriate session.</w:t>
+      </w:r>
+    </w:p>
+    <w:p>
+      <w:pPr>
+        <w:rPr>
+          <w:rFonts w:ascii="Times New Roman" w:hAnsi="Times New Roman" w:cs="Times New Roman"/>
+          <w:sz w:val="18"/>
+          <w:szCs w:val="18"/>
+        </w:rPr>
+      </w:pPr>
+      <w:r>
+        <w:rPr>
+          <w:rFonts w:ascii="Times New Roman" w:hAnsi="Times New Roman" w:cs="Times New Roman"/>
+          <w:sz w:val="18"/>
+          <w:szCs w:val="18"/>
+        </w:rPr>
+        <w:tab/>
+        <w:t xml:space="preserve">Sign </w:t>
+      </w:r>
+      <w:proofErr w:type="gramStart"/>
+      <w:r>
+        <w:rPr>
+          <w:rFonts w:ascii="Times New Roman" w:hAnsi="Times New Roman" w:cs="Times New Roman"/>
+          <w:sz w:val="18"/>
+          <w:szCs w:val="18"/>
+        </w:rPr>
+        <w:t>Up :</w:t>
+      </w:r>
+      <w:proofErr w:type="gramEnd"/>
+      <w:r>
+        <w:rPr>
+          <w:rFonts w:ascii="Times New Roman" w:hAnsi="Times New Roman" w:cs="Times New Roman"/>
+          <w:sz w:val="18"/>
+          <w:szCs w:val="18"/>
+        </w:rPr>
+        <w:t xml:space="preserve"> Text Spaces</w:t>
+      </w:r>
+    </w:p>
+    <w:p>
+      <w:pPr>
+        <w:pStyle w:val="ListParagraph"/>
+        <w:numPr>
+          <w:ilvl w:val="0"/>
+          <w:numId w:val="4"/>
+        </w:numPr>
+        <w:rPr>
+          <w:rFonts w:ascii="Times New Roman" w:hAnsi="Times New Roman" w:cs="Times New Roman"/>
+          <w:sz w:val="18"/>
+          <w:szCs w:val="18"/>
+        </w:rPr>
+      </w:pPr>
+      <w:r>
+        <w:rPr>
+          <w:rFonts w:ascii="Times New Roman" w:hAnsi="Times New Roman" w:cs="Times New Roman"/>
+          <w:sz w:val="18"/>
+          <w:szCs w:val="18"/>
+        </w:rPr>
+        <w:t>User inserts data into the name bars, password bar, and username</w:t>
+      </w:r>
+      <w:r>
+        <w:rPr>
+          <w:rFonts w:ascii="Times New Roman" w:hAnsi="Times New Roman" w:cs="Times New Roman"/>
+          <w:sz w:val="18"/>
+          <w:szCs w:val="18"/>
+        </w:rPr>
+        <w:t xml:space="preserve"> bar</w:t>
+      </w:r>
+      <w:r>
+        <w:rPr>
+          <w:rFonts w:ascii="Times New Roman" w:hAnsi="Times New Roman" w:cs="Times New Roman"/>
+          <w:sz w:val="18"/>
+          <w:szCs w:val="18"/>
+        </w:rPr>
+        <w:t xml:space="preserve"> and submits the </w:t>
+      </w:r>
+      <w:r>
+        <w:rPr>
+          <w:rFonts w:ascii="Times New Roman" w:hAnsi="Times New Roman" w:cs="Times New Roman"/>
+          <w:sz w:val="18"/>
+          <w:szCs w:val="18"/>
+        </w:rPr>
+        <w:t>input</w:t>
+      </w:r>
+      <w:r>
+        <w:rPr>
+          <w:rFonts w:ascii="Times New Roman" w:hAnsi="Times New Roman" w:cs="Times New Roman"/>
+          <w:sz w:val="18"/>
+          <w:szCs w:val="18"/>
+        </w:rPr>
+        <w:t xml:space="preserve"> using the available “Next” or “Done” button.</w:t>
+      </w:r>
+      <w:r>
+        <w:rPr>
+          <w:rFonts w:ascii="Times New Roman" w:hAnsi="Times New Roman" w:cs="Times New Roman"/>
+          <w:sz w:val="18"/>
+          <w:szCs w:val="18"/>
+        </w:rPr>
+        <w:t xml:space="preserve"> User is redirected and data is verified via passing through functions, then saved appropriately.</w:t>
+      </w:r>
+    </w:p>
+    <w:p>
+      <w:pPr>
+        <w:rPr>
+          <w:rFonts w:ascii="Times New Roman" w:hAnsi="Times New Roman" w:cs="Times New Roman"/>
+          <w:sz w:val="18"/>
+          <w:szCs w:val="18"/>
+        </w:rPr>
+      </w:pPr>
+      <w:r>
+        <w:rPr>
+          <w:rFonts w:ascii="Times New Roman" w:hAnsi="Times New Roman" w:cs="Times New Roman"/>
+          <w:sz w:val="18"/>
+          <w:szCs w:val="18"/>
+        </w:rPr>
+        <w:tab/>
+        <w:t xml:space="preserve">Sign </w:t>
+      </w:r>
+      <w:proofErr w:type="gramStart"/>
+      <w:r>
+        <w:rPr>
+          <w:rFonts w:ascii="Times New Roman" w:hAnsi="Times New Roman" w:cs="Times New Roman"/>
+          <w:sz w:val="18"/>
+          <w:szCs w:val="18"/>
+        </w:rPr>
+        <w:t>Up :</w:t>
+      </w:r>
+      <w:proofErr w:type="gramEnd"/>
+      <w:r>
+        <w:rPr>
+          <w:rFonts w:ascii="Times New Roman" w:hAnsi="Times New Roman" w:cs="Times New Roman"/>
+          <w:sz w:val="18"/>
+          <w:szCs w:val="18"/>
+        </w:rPr>
+        <w:t xml:space="preserve"> Buttons</w:t>
+      </w:r>
+    </w:p>
+    <w:p>
+      <w:pPr>
+        <w:pStyle w:val="ListParagraph"/>
+        <w:numPr>
+          <w:ilvl w:val="0"/>
+          <w:numId w:val="4"/>
+        </w:numPr>
+        <w:rPr>
+          <w:rFonts w:ascii="Times New Roman" w:hAnsi="Times New Roman" w:cs="Times New Roman"/>
+          <w:sz w:val="18"/>
+          <w:szCs w:val="18"/>
+        </w:rPr>
+      </w:pPr>
+      <w:r>
+        <w:rPr>
+          <w:rFonts w:ascii="Times New Roman" w:hAnsi="Times New Roman" w:cs="Times New Roman"/>
+          <w:sz w:val="18"/>
+          <w:szCs w:val="18"/>
+        </w:rPr>
+        <w:t>If the user presses the “Sign Up” button, they are directed to a screen to input their first name, last name, and role.</w:t>
+      </w:r>
+      <w:r>
+        <w:rPr>
+          <w:rFonts w:ascii="Times New Roman" w:hAnsi="Times New Roman" w:cs="Times New Roman"/>
+          <w:sz w:val="18"/>
+          <w:szCs w:val="18"/>
+        </w:rPr>
+        <w:t xml:space="preserve"> After providing input, the user clicks the “Next” button. The inputs for first and last name are passed through the appropriate functions for verifications and then used to create an instance of Account. The user is then sent to the second sign up screen.</w:t>
+      </w:r>
+    </w:p>
+    <w:p>
+      <w:pPr>
+        <w:pStyle w:val="ListParagraph"/>
+        <w:numPr>
+          <w:ilvl w:val="0"/>
+          <w:numId w:val="4"/>
+        </w:numPr>
+        <w:rPr>
+          <w:rFonts w:ascii="Times New Roman" w:hAnsi="Times New Roman" w:cs="Times New Roman"/>
+          <w:sz w:val="18"/>
+          <w:szCs w:val="18"/>
+        </w:rPr>
+      </w:pPr>
+      <w:r>
+        <w:rPr>
+          <w:rFonts w:ascii="Times New Roman" w:hAnsi="Times New Roman" w:cs="Times New Roman"/>
+          <w:sz w:val="18"/>
+          <w:szCs w:val="18"/>
+        </w:rPr>
+        <w:t>The user provides their assigned username and creates a password. Both inputs are passed through the appropriate functions and then stored in the appropriate lists.</w:t>
+      </w:r>
+    </w:p>
+    <w:p>
+      <w:pPr>
+        <w:rPr>
+          <w:rFonts w:ascii="Times New Roman" w:hAnsi="Times New Roman" w:cs="Times New Roman"/>
+          <w:sz w:val="18"/>
+          <w:szCs w:val="18"/>
+        </w:rPr>
+      </w:pPr>
+      <w:r>
+        <w:rPr>
+          <w:rFonts w:ascii="Times New Roman" w:hAnsi="Times New Roman" w:cs="Times New Roman"/>
+          <w:sz w:val="18"/>
+          <w:szCs w:val="18"/>
+        </w:rPr>
+        <w:tab/>
+        <w:t xml:space="preserve">Sign </w:t>
+      </w:r>
+      <w:proofErr w:type="gramStart"/>
+      <w:r>
+        <w:rPr>
+          <w:rFonts w:ascii="Times New Roman" w:hAnsi="Times New Roman" w:cs="Times New Roman"/>
+          <w:sz w:val="18"/>
+          <w:szCs w:val="18"/>
+        </w:rPr>
+        <w:t>Up :</w:t>
+      </w:r>
+      <w:proofErr w:type="gramEnd"/>
+      <w:r>
+        <w:rPr>
+          <w:rFonts w:ascii="Times New Roman" w:hAnsi="Times New Roman" w:cs="Times New Roman"/>
+          <w:sz w:val="18"/>
+          <w:szCs w:val="18"/>
+        </w:rPr>
+        <w:t xml:space="preserve"> Role Selection</w:t>
+      </w:r>
+    </w:p>
+    <w:p>
+      <w:pPr>
+        <w:pStyle w:val="ListParagraph"/>
+        <w:numPr>
+          <w:ilvl w:val="0"/>
+          <w:numId w:val="4"/>
+        </w:numPr>
+        <w:rPr>
+          <w:rFonts w:ascii="Times New Roman" w:hAnsi="Times New Roman" w:cs="Times New Roman"/>
+          <w:sz w:val="18"/>
+          <w:szCs w:val="18"/>
+        </w:rPr>
+      </w:pPr>
+      <w:r>
+        <w:rPr>
+          <w:rFonts w:ascii="Times New Roman" w:hAnsi="Times New Roman" w:cs="Times New Roman"/>
+          <w:sz w:val="18"/>
+          <w:szCs w:val="18"/>
+        </w:rPr>
+        <w:t xml:space="preserve">User clicks the dropdown arrow and </w:t>
+      </w:r>
+      <w:proofErr w:type="gramStart"/>
+      <w:r>
+        <w:rPr>
+          <w:rFonts w:ascii="Times New Roman" w:hAnsi="Times New Roman" w:cs="Times New Roman"/>
+          <w:sz w:val="18"/>
+          <w:szCs w:val="18"/>
+        </w:rPr>
+        <w:t>the</w:t>
+      </w:r>
+      <w:proofErr w:type="gramEnd"/>
+      <w:r>
+        <w:rPr>
+          <w:rFonts w:ascii="Times New Roman" w:hAnsi="Times New Roman" w:cs="Times New Roman"/>
+          <w:sz w:val="18"/>
+          <w:szCs w:val="18"/>
+        </w:rPr>
+        <w:t xml:space="preserve"> clicks their role.</w:t>
+      </w:r>
     </w:p>
     <w:p>
       <w:pPr>
@@ -760,7 +2357,6 @@
           <w:sz w:val="18"/>
           <w:szCs w:val="18"/>
         </w:rPr>
-        <w:lastRenderedPageBreak/>
         <w:t>Incorrect username</w:t>
       </w:r>
     </w:p>
@@ -990,6 +2586,7 @@
           <w:sz w:val="18"/>
           <w:szCs w:val="18"/>
         </w:rPr>
+        <w:lastRenderedPageBreak/>
         <w:t>If neither or only one variable value matches</w:t>
       </w:r>
       <w:r>
@@ -1500,7 +3097,6 @@
           <w:sz w:val="18"/>
           <w:szCs w:val="18"/>
         </w:rPr>
-        <w:lastRenderedPageBreak/>
         <w:t>User inputs username</w:t>
       </w:r>
     </w:p>
@@ -1769,6 +3365,7 @@
           <w:sz w:val="18"/>
           <w:szCs w:val="18"/>
         </w:rPr>
+        <w:lastRenderedPageBreak/>
         <w:t>All given data is used to create an instance/object of the class Account and is saved to the system’s database.</w:t>
       </w:r>
     </w:p>
@@ -1808,6 +3405,118 @@
 <file path=word/numbering.xml><?xml version="1.0" encoding="utf-8"?>
 <w:numbering xmlns:wpc="http://schemas.microsoft.com/office/word/2010/wordprocessingCanvas" xmlns:cx="http://schemas.microsoft.com/office/drawing/2014/chartex" xmlns:cx1="http://schemas.microsoft.com/office/drawing/2015/9/8/chartex" xmlns:cx2="http://schemas.microsoft.com/office/drawing/2015/10/21/chartex" xmlns:cx3="http://schemas.microsoft.com/office/drawing/2016/5/9/chartex" xmlns:cx4="http://schemas.microsoft.com/office/drawing/2016/5/10/chartex" xmlns:cx5="http://schemas.microsoft.com/office/drawing/2016/5/11/chartex" xmlns:cx6="http://schemas.microsoft.com/office/drawing/2016/5/12/chartex" xmlns:cx7="http://schemas.microsoft.com/office/drawing/2016/5/13/chartex" xmlns:cx8="http://schemas.microsoft.com/office/drawing/2016/5/14/chartex" xmlns:mc="http://schemas.openxmlformats.org/markup-compatibility/2006" xmlns:aink="http://schemas.microsoft.com/office/drawing/2016/ink" xmlns:am3d="http://schemas.microsoft.com/office/drawing/2017/model3d" xmlns:o="urn:schemas-microsoft-com:office:office" xmlns:oel="http://schemas.microsoft.com/office/2019/extlst" xmlns:r="http://schemas.openxmlformats.org/officeDocument/2006/relationships" xmlns:m="http://schemas.openxmlformats.org/officeDocument/2006/math" xmlns:v="urn:schemas-microsoft-com:vml" xmlns:wp14="http://schemas.microsoft.com/office/word/2010/wordprocessingDrawing" xmlns:wp="http://schemas.openxmlformats.org/drawingml/2006/wordprocessingDrawing" xmlns:w10="urn:schemas-microsoft-com:office:word" xmlns:w="http://schemas.openxmlformats.org/wordprocessingml/2006/main" xmlns:w14="http://schemas.microsoft.com/office/word/2010/wordml" xmlns:w15="http://schemas.microsoft.com/office/word/2012/wordml" xmlns:w16cex="http://schemas.microsoft.com/office/word/2018/wordml/cex" xmlns:w16cid="http://schemas.microsoft.com/office/word/2016/wordml/cid" xmlns:w16="http://schemas.microsoft.com/office/word/2018/wordml" xmlns:w16du="http://schemas.microsoft.com/office/word/2023/wordml/word16du" xmlns:w16sdtdh="http://schemas.microsoft.com/office/word/2020/wordml/sdtdatahash" xmlns:w16sdtfl="http://schemas.microsoft.com/office/word/2024/wordml/sdtformatlock" xmlns:w16se="http://schemas.microsoft.com/office/word/2015/wordml/symex" xmlns:wpg="http://schemas.microsoft.com/office/word/2010/wordprocessingGroup" xmlns:wpi="http://schemas.microsoft.com/office/word/2010/wordprocessingInk" xmlns:wne="http://schemas.microsoft.com/office/word/2006/wordml" xmlns:wps="http://schemas.microsoft.com/office/word/2010/wordprocessingShape" mc:Ignorable="w14 w15 w16se w16cid w16 w16cex w16sdtdh w16sdtfl w16du wp14">
   <w:abstractNum w:abstractNumId="0" w15:restartNumberingAfterBreak="0">
+    <w:nsid w:val="030C1EC9"/>
+    <w:multiLevelType w:val="hybridMultilevel"/>
+    <w:tmpl w:val="0760424C"/>
+    <w:lvl w:ilvl="0" w:tplc="7DAA664C">
+      <w:numFmt w:val="bullet"/>
+      <w:lvlText w:val=""/>
+      <w:lvlJc w:val="left"/>
+      <w:pPr>
+        <w:ind w:left="1800" w:hanging="360"/>
+      </w:pPr>
+      <w:rPr>
+        <w:rFonts w:ascii="Symbol" w:eastAsiaTheme="minorHAnsi" w:hAnsi="Symbol" w:cs="Times New Roman" w:hint="default"/>
+      </w:rPr>
+    </w:lvl>
+    <w:lvl w:ilvl="1" w:tplc="04090003" w:tentative="1">
+      <w:start w:val="1"/>
+      <w:numFmt w:val="bullet"/>
+      <w:lvlText w:val="o"/>
+      <w:lvlJc w:val="left"/>
+      <w:pPr>
+        <w:ind w:left="2520" w:hanging="360"/>
+      </w:pPr>
+      <w:rPr>
+        <w:rFonts w:ascii="Courier New" w:hAnsi="Courier New" w:cs="Courier New" w:hint="default"/>
+      </w:rPr>
+    </w:lvl>
+    <w:lvl w:ilvl="2" w:tplc="04090005" w:tentative="1">
+      <w:start w:val="1"/>
+      <w:numFmt w:val="bullet"/>
+      <w:lvlText w:val=""/>
+      <w:lvlJc w:val="left"/>
+      <w:pPr>
+        <w:ind w:left="3240" w:hanging="360"/>
+      </w:pPr>
+      <w:rPr>
+        <w:rFonts w:ascii="Wingdings" w:hAnsi="Wingdings" w:hint="default"/>
+      </w:rPr>
+    </w:lvl>
+    <w:lvl w:ilvl="3" w:tplc="04090001" w:tentative="1">
+      <w:start w:val="1"/>
+      <w:numFmt w:val="bullet"/>
+      <w:lvlText w:val=""/>
+      <w:lvlJc w:val="left"/>
+      <w:pPr>
+        <w:ind w:left="3960" w:hanging="360"/>
+      </w:pPr>
+      <w:rPr>
+        <w:rFonts w:ascii="Symbol" w:hAnsi="Symbol" w:hint="default"/>
+      </w:rPr>
+    </w:lvl>
+    <w:lvl w:ilvl="4" w:tplc="04090003" w:tentative="1">
+      <w:start w:val="1"/>
+      <w:numFmt w:val="bullet"/>
+      <w:lvlText w:val="o"/>
+      <w:lvlJc w:val="left"/>
+      <w:pPr>
+        <w:ind w:left="4680" w:hanging="360"/>
+      </w:pPr>
+      <w:rPr>
+        <w:rFonts w:ascii="Courier New" w:hAnsi="Courier New" w:cs="Courier New" w:hint="default"/>
+      </w:rPr>
+    </w:lvl>
+    <w:lvl w:ilvl="5" w:tplc="04090005" w:tentative="1">
+      <w:start w:val="1"/>
+      <w:numFmt w:val="bullet"/>
+      <w:lvlText w:val=""/>
+      <w:lvlJc w:val="left"/>
+      <w:pPr>
+        <w:ind w:left="5400" w:hanging="360"/>
+      </w:pPr>
+      <w:rPr>
+        <w:rFonts w:ascii="Wingdings" w:hAnsi="Wingdings" w:hint="default"/>
+      </w:rPr>
+    </w:lvl>
+    <w:lvl w:ilvl="6" w:tplc="04090001" w:tentative="1">
+      <w:start w:val="1"/>
+      <w:numFmt w:val="bullet"/>
+      <w:lvlText w:val=""/>
+      <w:lvlJc w:val="left"/>
+      <w:pPr>
+        <w:ind w:left="6120" w:hanging="360"/>
+      </w:pPr>
+      <w:rPr>
+        <w:rFonts w:ascii="Symbol" w:hAnsi="Symbol" w:hint="default"/>
+      </w:rPr>
+    </w:lvl>
+    <w:lvl w:ilvl="7" w:tplc="04090003" w:tentative="1">
+      <w:start w:val="1"/>
+      <w:numFmt w:val="bullet"/>
+      <w:lvlText w:val="o"/>
+      <w:lvlJc w:val="left"/>
+      <w:pPr>
+        <w:ind w:left="6840" w:hanging="360"/>
+      </w:pPr>
+      <w:rPr>
+        <w:rFonts w:ascii="Courier New" w:hAnsi="Courier New" w:cs="Courier New" w:hint="default"/>
+      </w:rPr>
+    </w:lvl>
+    <w:lvl w:ilvl="8" w:tplc="04090005" w:tentative="1">
+      <w:start w:val="1"/>
+      <w:numFmt w:val="bullet"/>
+      <w:lvlText w:val=""/>
+      <w:lvlJc w:val="left"/>
+      <w:pPr>
+        <w:ind w:left="7560" w:hanging="360"/>
+      </w:pPr>
+      <w:rPr>
+        <w:rFonts w:ascii="Wingdings" w:hAnsi="Wingdings" w:hint="default"/>
+      </w:rPr>
+    </w:lvl>
+  </w:abstractNum>
+  <w:abstractNum w:abstractNumId="1" w15:restartNumberingAfterBreak="0">
     <w:nsid w:val="10901330"/>
     <w:multiLevelType w:val="hybridMultilevel"/>
     <w:tmpl w:val="4074369E"/>
@@ -1896,7 +3605,7 @@
       </w:pPr>
     </w:lvl>
   </w:abstractNum>
-  <w:abstractNum w:abstractNumId="1" w15:restartNumberingAfterBreak="0">
+  <w:abstractNum w:abstractNumId="2" w15:restartNumberingAfterBreak="0">
     <w:nsid w:val="3FA43CCB"/>
     <w:multiLevelType w:val="hybridMultilevel"/>
     <w:tmpl w:val="63F2BEF0"/>
@@ -2009,7 +3718,7 @@
       </w:rPr>
     </w:lvl>
   </w:abstractNum>
-  <w:abstractNum w:abstractNumId="2" w15:restartNumberingAfterBreak="0">
+  <w:abstractNum w:abstractNumId="3" w15:restartNumberingAfterBreak="0">
     <w:nsid w:val="4A6C59DA"/>
     <w:multiLevelType w:val="hybridMultilevel"/>
     <w:tmpl w:val="5DC6D164"/>
@@ -2098,7 +3807,7 @@
       </w:pPr>
     </w:lvl>
   </w:abstractNum>
-  <w:abstractNum w:abstractNumId="3" w15:restartNumberingAfterBreak="0">
+  <w:abstractNum w:abstractNumId="4" w15:restartNumberingAfterBreak="0">
     <w:nsid w:val="557A6B48"/>
     <w:multiLevelType w:val="hybridMultilevel"/>
     <w:tmpl w:val="7608A328"/>
@@ -2187,7 +3896,232 @@
       </w:pPr>
     </w:lvl>
   </w:abstractNum>
-  <w:abstractNum w:abstractNumId="4" w15:restartNumberingAfterBreak="0">
+  <w:abstractNum w:abstractNumId="5" w15:restartNumberingAfterBreak="0">
+    <w:nsid w:val="60B07BCE"/>
+    <w:multiLevelType w:val="hybridMultilevel"/>
+    <w:tmpl w:val="4D00581A"/>
+    <w:lvl w:ilvl="0" w:tplc="EB0CEF92">
+      <w:numFmt w:val="bullet"/>
+      <w:lvlText w:val=""/>
+      <w:lvlJc w:val="left"/>
+      <w:pPr>
+        <w:ind w:left="1080" w:hanging="360"/>
+      </w:pPr>
+      <w:rPr>
+        <w:rFonts w:ascii="Symbol" w:eastAsiaTheme="minorHAnsi" w:hAnsi="Symbol" w:cs="Times New Roman" w:hint="default"/>
+        <w:u w:val="single"/>
+      </w:rPr>
+    </w:lvl>
+    <w:lvl w:ilvl="1" w:tplc="04090003" w:tentative="1">
+      <w:start w:val="1"/>
+      <w:numFmt w:val="bullet"/>
+      <w:lvlText w:val="o"/>
+      <w:lvlJc w:val="left"/>
+      <w:pPr>
+        <w:ind w:left="1800" w:hanging="360"/>
+      </w:pPr>
+      <w:rPr>
+        <w:rFonts w:ascii="Courier New" w:hAnsi="Courier New" w:cs="Courier New" w:hint="default"/>
+      </w:rPr>
+    </w:lvl>
+    <w:lvl w:ilvl="2" w:tplc="04090005" w:tentative="1">
+      <w:start w:val="1"/>
+      <w:numFmt w:val="bullet"/>
+      <w:lvlText w:val=""/>
+      <w:lvlJc w:val="left"/>
+      <w:pPr>
+        <w:ind w:left="2520" w:hanging="360"/>
+      </w:pPr>
+      <w:rPr>
+        <w:rFonts w:ascii="Wingdings" w:hAnsi="Wingdings" w:hint="default"/>
+      </w:rPr>
+    </w:lvl>
+    <w:lvl w:ilvl="3" w:tplc="04090001" w:tentative="1">
+      <w:start w:val="1"/>
+      <w:numFmt w:val="bullet"/>
+      <w:lvlText w:val=""/>
+      <w:lvlJc w:val="left"/>
+      <w:pPr>
+        <w:ind w:left="3240" w:hanging="360"/>
+      </w:pPr>
+      <w:rPr>
+        <w:rFonts w:ascii="Symbol" w:hAnsi="Symbol" w:hint="default"/>
+      </w:rPr>
+    </w:lvl>
+    <w:lvl w:ilvl="4" w:tplc="04090003" w:tentative="1">
+      <w:start w:val="1"/>
+      <w:numFmt w:val="bullet"/>
+      <w:lvlText w:val="o"/>
+      <w:lvlJc w:val="left"/>
+      <w:pPr>
+        <w:ind w:left="3960" w:hanging="360"/>
+      </w:pPr>
+      <w:rPr>
+        <w:rFonts w:ascii="Courier New" w:hAnsi="Courier New" w:cs="Courier New" w:hint="default"/>
+      </w:rPr>
+    </w:lvl>
+    <w:lvl w:ilvl="5" w:tplc="04090005" w:tentative="1">
+      <w:start w:val="1"/>
+      <w:numFmt w:val="bullet"/>
+      <w:lvlText w:val=""/>
+      <w:lvlJc w:val="left"/>
+      <w:pPr>
+        <w:ind w:left="4680" w:hanging="360"/>
+      </w:pPr>
+      <w:rPr>
+        <w:rFonts w:ascii="Wingdings" w:hAnsi="Wingdings" w:hint="default"/>
+      </w:rPr>
+    </w:lvl>
+    <w:lvl w:ilvl="6" w:tplc="04090001" w:tentative="1">
+      <w:start w:val="1"/>
+      <w:numFmt w:val="bullet"/>
+      <w:lvlText w:val=""/>
+      <w:lvlJc w:val="left"/>
+      <w:pPr>
+        <w:ind w:left="5400" w:hanging="360"/>
+      </w:pPr>
+      <w:rPr>
+        <w:rFonts w:ascii="Symbol" w:hAnsi="Symbol" w:hint="default"/>
+      </w:rPr>
+    </w:lvl>
+    <w:lvl w:ilvl="7" w:tplc="04090003" w:tentative="1">
+      <w:start w:val="1"/>
+      <w:numFmt w:val="bullet"/>
+      <w:lvlText w:val="o"/>
+      <w:lvlJc w:val="left"/>
+      <w:pPr>
+        <w:ind w:left="6120" w:hanging="360"/>
+      </w:pPr>
+      <w:rPr>
+        <w:rFonts w:ascii="Courier New" w:hAnsi="Courier New" w:cs="Courier New" w:hint="default"/>
+      </w:rPr>
+    </w:lvl>
+    <w:lvl w:ilvl="8" w:tplc="04090005" w:tentative="1">
+      <w:start w:val="1"/>
+      <w:numFmt w:val="bullet"/>
+      <w:lvlText w:val=""/>
+      <w:lvlJc w:val="left"/>
+      <w:pPr>
+        <w:ind w:left="6840" w:hanging="360"/>
+      </w:pPr>
+      <w:rPr>
+        <w:rFonts w:ascii="Wingdings" w:hAnsi="Wingdings" w:hint="default"/>
+      </w:rPr>
+    </w:lvl>
+  </w:abstractNum>
+  <w:abstractNum w:abstractNumId="6" w15:restartNumberingAfterBreak="0">
+    <w:nsid w:val="62FF1619"/>
+    <w:multiLevelType w:val="hybridMultilevel"/>
+    <w:tmpl w:val="A93AB822"/>
+    <w:lvl w:ilvl="0" w:tplc="ED7C60F2">
+      <w:numFmt w:val="bullet"/>
+      <w:lvlText w:val=""/>
+      <w:lvlJc w:val="left"/>
+      <w:pPr>
+        <w:ind w:left="2520" w:hanging="360"/>
+      </w:pPr>
+      <w:rPr>
+        <w:rFonts w:ascii="Symbol" w:eastAsiaTheme="minorHAnsi" w:hAnsi="Symbol" w:cs="Times New Roman" w:hint="default"/>
+      </w:rPr>
+    </w:lvl>
+    <w:lvl w:ilvl="1" w:tplc="04090003" w:tentative="1">
+      <w:start w:val="1"/>
+      <w:numFmt w:val="bullet"/>
+      <w:lvlText w:val="o"/>
+      <w:lvlJc w:val="left"/>
+      <w:pPr>
+        <w:ind w:left="3240" w:hanging="360"/>
+      </w:pPr>
+      <w:rPr>
+        <w:rFonts w:ascii="Courier New" w:hAnsi="Courier New" w:cs="Courier New" w:hint="default"/>
+      </w:rPr>
+    </w:lvl>
+    <w:lvl w:ilvl="2" w:tplc="04090005" w:tentative="1">
+      <w:start w:val="1"/>
+      <w:numFmt w:val="bullet"/>
+      <w:lvlText w:val=""/>
+      <w:lvlJc w:val="left"/>
+      <w:pPr>
+        <w:ind w:left="3960" w:hanging="360"/>
+      </w:pPr>
+      <w:rPr>
+        <w:rFonts w:ascii="Wingdings" w:hAnsi="Wingdings" w:hint="default"/>
+      </w:rPr>
+    </w:lvl>
+    <w:lvl w:ilvl="3" w:tplc="04090001" w:tentative="1">
+      <w:start w:val="1"/>
+      <w:numFmt w:val="bullet"/>
+      <w:lvlText w:val=""/>
+      <w:lvlJc w:val="left"/>
+      <w:pPr>
+        <w:ind w:left="4680" w:hanging="360"/>
+      </w:pPr>
+      <w:rPr>
+        <w:rFonts w:ascii="Symbol" w:hAnsi="Symbol" w:hint="default"/>
+      </w:rPr>
+    </w:lvl>
+    <w:lvl w:ilvl="4" w:tplc="04090003" w:tentative="1">
+      <w:start w:val="1"/>
+      <w:numFmt w:val="bullet"/>
+      <w:lvlText w:val="o"/>
+      <w:lvlJc w:val="left"/>
+      <w:pPr>
+        <w:ind w:left="5400" w:hanging="360"/>
+      </w:pPr>
+      <w:rPr>
+        <w:rFonts w:ascii="Courier New" w:hAnsi="Courier New" w:cs="Courier New" w:hint="default"/>
+      </w:rPr>
+    </w:lvl>
+    <w:lvl w:ilvl="5" w:tplc="04090005" w:tentative="1">
+      <w:start w:val="1"/>
+      <w:numFmt w:val="bullet"/>
+      <w:lvlText w:val=""/>
+      <w:lvlJc w:val="left"/>
+      <w:pPr>
+        <w:ind w:left="6120" w:hanging="360"/>
+      </w:pPr>
+      <w:rPr>
+        <w:rFonts w:ascii="Wingdings" w:hAnsi="Wingdings" w:hint="default"/>
+      </w:rPr>
+    </w:lvl>
+    <w:lvl w:ilvl="6" w:tplc="04090001" w:tentative="1">
+      <w:start w:val="1"/>
+      <w:numFmt w:val="bullet"/>
+      <w:lvlText w:val=""/>
+      <w:lvlJc w:val="left"/>
+      <w:pPr>
+        <w:ind w:left="6840" w:hanging="360"/>
+      </w:pPr>
+      <w:rPr>
+        <w:rFonts w:ascii="Symbol" w:hAnsi="Symbol" w:hint="default"/>
+      </w:rPr>
+    </w:lvl>
+    <w:lvl w:ilvl="7" w:tplc="04090003" w:tentative="1">
+      <w:start w:val="1"/>
+      <w:numFmt w:val="bullet"/>
+      <w:lvlText w:val="o"/>
+      <w:lvlJc w:val="left"/>
+      <w:pPr>
+        <w:ind w:left="7560" w:hanging="360"/>
+      </w:pPr>
+      <w:rPr>
+        <w:rFonts w:ascii="Courier New" w:hAnsi="Courier New" w:cs="Courier New" w:hint="default"/>
+      </w:rPr>
+    </w:lvl>
+    <w:lvl w:ilvl="8" w:tplc="04090005" w:tentative="1">
+      <w:start w:val="1"/>
+      <w:numFmt w:val="bullet"/>
+      <w:lvlText w:val=""/>
+      <w:lvlJc w:val="left"/>
+      <w:pPr>
+        <w:ind w:left="8280" w:hanging="360"/>
+      </w:pPr>
+      <w:rPr>
+        <w:rFonts w:ascii="Wingdings" w:hAnsi="Wingdings" w:hint="default"/>
+      </w:rPr>
+    </w:lvl>
+  </w:abstractNum>
+  <w:abstractNum w:abstractNumId="7" w15:restartNumberingAfterBreak="0">
     <w:nsid w:val="7E014C06"/>
     <w:multiLevelType w:val="hybridMultilevel"/>
     <w:tmpl w:val="84705F16"/>
@@ -2300,19 +4234,28 @@
     </w:lvl>
   </w:abstractNum>
   <w:num w:numId="1" w16cid:durableId="1878932398">
+    <w:abstractNumId w:val="1"/>
+  </w:num>
+  <w:num w:numId="2" w16cid:durableId="141435576">
+    <w:abstractNumId w:val="3"/>
+  </w:num>
+  <w:num w:numId="3" w16cid:durableId="805199316">
+    <w:abstractNumId w:val="4"/>
+  </w:num>
+  <w:num w:numId="4" w16cid:durableId="61103547">
+    <w:abstractNumId w:val="7"/>
+  </w:num>
+  <w:num w:numId="5" w16cid:durableId="1796486732">
+    <w:abstractNumId w:val="2"/>
+  </w:num>
+  <w:num w:numId="6" w16cid:durableId="1444878852">
     <w:abstractNumId w:val="0"/>
   </w:num>
-  <w:num w:numId="2" w16cid:durableId="141435576">
-    <w:abstractNumId w:val="2"/>
+  <w:num w:numId="7" w16cid:durableId="381713565">
+    <w:abstractNumId w:val="5"/>
   </w:num>
-  <w:num w:numId="3" w16cid:durableId="805199316">
-    <w:abstractNumId w:val="3"/>
-  </w:num>
-  <w:num w:numId="4" w16cid:durableId="61103547">
-    <w:abstractNumId w:val="4"/>
-  </w:num>
-  <w:num w:numId="5" w16cid:durableId="1796486732">
-    <w:abstractNumId w:val="1"/>
+  <w:num w:numId="8" w16cid:durableId="934240702">
+    <w:abstractNumId w:val="6"/>
   </w:num>
 </w:numbering>
 </file>

</xml_diff>